<commit_message>
done day11 with reports
</commit_message>
<xml_diff>
--- a/week3/day11_Sunday/reports/Day11_MQTT_Pairing_Technical_Report.docx
+++ b/week3/day11_Sunday/reports/Day11_MQTT_Pairing_Technical_Report.docx
@@ -156,18 +156,8 @@
                 <w:sz w:val="20"/>
                 <w:szCs w:val="20"/>
               </w:rPr>
-              <w:t xml:space="preserve">ESP32 · Arduino Framework · </w:t>
-            </w:r>
-            <w:proofErr w:type="spellStart"/>
-            <w:r>
-              <w:rPr>
-                <w:color w:val="333333"/>
-                <w:sz w:val="20"/>
-                <w:szCs w:val="20"/>
-              </w:rPr>
-              <w:t>PlatformIO</w:t>
-            </w:r>
-            <w:proofErr w:type="spellEnd"/>
+              <w:t xml:space="preserve">ESP32 · Arduino Framework · PlatformIO</w:t>
+            </w:r>
           </w:p>
         </w:tc>
       </w:tr>
@@ -229,23 +219,7 @@
                 <w:sz w:val="20"/>
                 <w:szCs w:val="20"/>
               </w:rPr>
-              <w:t>MQTT Symmetric</w:t>
-            </w:r>
-            <w:r>
-              <w:rPr>
-                <w:color w:val="333333"/>
-                <w:sz w:val="20"/>
-                <w:szCs w:val="20"/>
-              </w:rPr>
-              <w:t xml:space="preserve"> </w:t>
-            </w:r>
-            <w:r>
-              <w:rPr>
-                <w:color w:val="333333"/>
-                <w:sz w:val="20"/>
-                <w:szCs w:val="20"/>
-              </w:rPr>
-              <w:t>Two-Topic Pairing — IR Sensor &amp; L298N Motor Boards</w:t>
+              <w:t xml:space="preserve">MQTT Symmetric Two-Topic Pairing — Two Identical IR Sensor + L298N Motor Boards</w:t>
             </w:r>
           </w:p>
         </w:tc>
@@ -300,35 +274,7 @@
                 <w:sz w:val="20"/>
                 <w:szCs w:val="20"/>
               </w:rPr>
-              <w:t xml:space="preserve">Public MQTT Broker (broker.emqx.io / </w:t>
-            </w:r>
-            <w:proofErr w:type="spellStart"/>
-            <w:proofErr w:type="gramStart"/>
-            <w:r>
-              <w:rPr>
-                <w:color w:val="333333"/>
-                <w:sz w:val="20"/>
-                <w:szCs w:val="20"/>
-              </w:rPr>
-              <w:t>iot.coreflux</w:t>
-            </w:r>
-            <w:proofErr w:type="gramEnd"/>
-            <w:r>
-              <w:rPr>
-                <w:color w:val="333333"/>
-                <w:sz w:val="20"/>
-                <w:szCs w:val="20"/>
-              </w:rPr>
-              <w:t>.cloud</w:t>
-            </w:r>
-            <w:proofErr w:type="spellEnd"/>
-            <w:r>
-              <w:rPr>
-                <w:color w:val="333333"/>
-                <w:sz w:val="20"/>
-                <w:szCs w:val="20"/>
-              </w:rPr>
-              <w:t>)</w:t>
+              <w:t xml:space="preserve">Public MQTT Broker (broker.emqx.io / iot.coreflux.cloud)</w:t>
             </w:r>
           </w:p>
         </w:tc>
@@ -486,11 +432,7 @@
           </w:pPr>
           <w:r>
             <w:fldChar w:fldCharType="begin"/>
-          </w:r>
-          <w:r>
             <w:instrText xml:space="preserve"> TOC \o "1-3" \h \z \u </w:instrText>
-          </w:r>
-          <w:r>
             <w:fldChar w:fldCharType="separate"/>
           </w:r>
           <w:hyperlink w:anchor="_Toc236651246" w:history="1">
@@ -509,46 +451,10 @@
                 <w:webHidden/>
               </w:rPr>
               <w:tab/>
-            </w:r>
-            <w:r>
-              <w:rPr>
-                <w:noProof/>
-                <w:webHidden/>
-              </w:rPr>
               <w:fldChar w:fldCharType="begin"/>
-            </w:r>
-            <w:r>
-              <w:rPr>
-                <w:noProof/>
-                <w:webHidden/>
-              </w:rPr>
               <w:instrText xml:space="preserve"> PAGEREF _Toc236651246 \h </w:instrText>
-            </w:r>
-            <w:r>
-              <w:rPr>
-                <w:noProof/>
-                <w:webHidden/>
-              </w:rPr>
-            </w:r>
-            <w:r>
-              <w:rPr>
-                <w:noProof/>
-                <w:webHidden/>
-              </w:rPr>
               <w:fldChar w:fldCharType="separate"/>
-            </w:r>
-            <w:r>
-              <w:rPr>
-                <w:noProof/>
-                <w:webHidden/>
-              </w:rPr>
               <w:t>3</w:t>
-            </w:r>
-            <w:r>
-              <w:rPr>
-                <w:noProof/>
-                <w:webHidden/>
-              </w:rPr>
               <w:fldChar w:fldCharType="end"/>
             </w:r>
           </w:hyperlink>
@@ -584,46 +490,10 @@
                 <w:webHidden/>
               </w:rPr>
               <w:tab/>
-            </w:r>
-            <w:r>
-              <w:rPr>
-                <w:noProof/>
-                <w:webHidden/>
-              </w:rPr>
               <w:fldChar w:fldCharType="begin"/>
-            </w:r>
-            <w:r>
-              <w:rPr>
-                <w:noProof/>
-                <w:webHidden/>
-              </w:rPr>
               <w:instrText xml:space="preserve"> PAGEREF _Toc236651247 \h </w:instrText>
-            </w:r>
-            <w:r>
-              <w:rPr>
-                <w:noProof/>
-                <w:webHidden/>
-              </w:rPr>
-            </w:r>
-            <w:r>
-              <w:rPr>
-                <w:noProof/>
-                <w:webHidden/>
-              </w:rPr>
               <w:fldChar w:fldCharType="separate"/>
-            </w:r>
-            <w:r>
-              <w:rPr>
-                <w:noProof/>
-                <w:webHidden/>
-              </w:rPr>
               <w:t>3</w:t>
-            </w:r>
-            <w:r>
-              <w:rPr>
-                <w:noProof/>
-                <w:webHidden/>
-              </w:rPr>
               <w:fldChar w:fldCharType="end"/>
             </w:r>
           </w:hyperlink>
@@ -659,46 +529,10 @@
                 <w:webHidden/>
               </w:rPr>
               <w:tab/>
-            </w:r>
-            <w:r>
-              <w:rPr>
-                <w:noProof/>
-                <w:webHidden/>
-              </w:rPr>
               <w:fldChar w:fldCharType="begin"/>
-            </w:r>
-            <w:r>
-              <w:rPr>
-                <w:noProof/>
-                <w:webHidden/>
-              </w:rPr>
               <w:instrText xml:space="preserve"> PAGEREF _Toc236651248 \h </w:instrText>
-            </w:r>
-            <w:r>
-              <w:rPr>
-                <w:noProof/>
-                <w:webHidden/>
-              </w:rPr>
-            </w:r>
-            <w:r>
-              <w:rPr>
-                <w:noProof/>
-                <w:webHidden/>
-              </w:rPr>
               <w:fldChar w:fldCharType="separate"/>
-            </w:r>
-            <w:r>
-              <w:rPr>
-                <w:noProof/>
-                <w:webHidden/>
-              </w:rPr>
               <w:t>3</w:t>
-            </w:r>
-            <w:r>
-              <w:rPr>
-                <w:noProof/>
-                <w:webHidden/>
-              </w:rPr>
               <w:fldChar w:fldCharType="end"/>
             </w:r>
           </w:hyperlink>
@@ -734,46 +568,10 @@
                 <w:webHidden/>
               </w:rPr>
               <w:tab/>
-            </w:r>
-            <w:r>
-              <w:rPr>
-                <w:noProof/>
-                <w:webHidden/>
-              </w:rPr>
               <w:fldChar w:fldCharType="begin"/>
-            </w:r>
-            <w:r>
-              <w:rPr>
-                <w:noProof/>
-                <w:webHidden/>
-              </w:rPr>
               <w:instrText xml:space="preserve"> PAGEREF _Toc236651249 \h </w:instrText>
-            </w:r>
-            <w:r>
-              <w:rPr>
-                <w:noProof/>
-                <w:webHidden/>
-              </w:rPr>
-            </w:r>
-            <w:r>
-              <w:rPr>
-                <w:noProof/>
-                <w:webHidden/>
-              </w:rPr>
               <w:fldChar w:fldCharType="separate"/>
-            </w:r>
-            <w:r>
-              <w:rPr>
-                <w:noProof/>
-                <w:webHidden/>
-              </w:rPr>
               <w:t>4</w:t>
-            </w:r>
-            <w:r>
-              <w:rPr>
-                <w:noProof/>
-                <w:webHidden/>
-              </w:rPr>
               <w:fldChar w:fldCharType="end"/>
             </w:r>
           </w:hyperlink>
@@ -809,46 +607,10 @@
                 <w:webHidden/>
               </w:rPr>
               <w:tab/>
-            </w:r>
-            <w:r>
-              <w:rPr>
-                <w:noProof/>
-                <w:webHidden/>
-              </w:rPr>
               <w:fldChar w:fldCharType="begin"/>
-            </w:r>
-            <w:r>
-              <w:rPr>
-                <w:noProof/>
-                <w:webHidden/>
-              </w:rPr>
               <w:instrText xml:space="preserve"> PAGEREF _Toc236651250 \h </w:instrText>
-            </w:r>
-            <w:r>
-              <w:rPr>
-                <w:noProof/>
-                <w:webHidden/>
-              </w:rPr>
-            </w:r>
-            <w:r>
-              <w:rPr>
-                <w:noProof/>
-                <w:webHidden/>
-              </w:rPr>
               <w:fldChar w:fldCharType="separate"/>
-            </w:r>
-            <w:r>
-              <w:rPr>
-                <w:noProof/>
-                <w:webHidden/>
-              </w:rPr>
               <w:t>4</w:t>
-            </w:r>
-            <w:r>
-              <w:rPr>
-                <w:noProof/>
-                <w:webHidden/>
-              </w:rPr>
               <w:fldChar w:fldCharType="end"/>
             </w:r>
           </w:hyperlink>
@@ -884,46 +646,10 @@
                 <w:webHidden/>
               </w:rPr>
               <w:tab/>
-            </w:r>
-            <w:r>
-              <w:rPr>
-                <w:noProof/>
-                <w:webHidden/>
-              </w:rPr>
               <w:fldChar w:fldCharType="begin"/>
-            </w:r>
-            <w:r>
-              <w:rPr>
-                <w:noProof/>
-                <w:webHidden/>
-              </w:rPr>
               <w:instrText xml:space="preserve"> PAGEREF _Toc236651251 \h </w:instrText>
-            </w:r>
-            <w:r>
-              <w:rPr>
-                <w:noProof/>
-                <w:webHidden/>
-              </w:rPr>
-            </w:r>
-            <w:r>
-              <w:rPr>
-                <w:noProof/>
-                <w:webHidden/>
-              </w:rPr>
               <w:fldChar w:fldCharType="separate"/>
-            </w:r>
-            <w:r>
-              <w:rPr>
-                <w:noProof/>
-                <w:webHidden/>
-              </w:rPr>
               <w:t>4</w:t>
-            </w:r>
-            <w:r>
-              <w:rPr>
-                <w:noProof/>
-                <w:webHidden/>
-              </w:rPr>
               <w:fldChar w:fldCharType="end"/>
             </w:r>
           </w:hyperlink>
@@ -959,46 +685,10 @@
                 <w:webHidden/>
               </w:rPr>
               <w:tab/>
-            </w:r>
-            <w:r>
-              <w:rPr>
-                <w:noProof/>
-                <w:webHidden/>
-              </w:rPr>
               <w:fldChar w:fldCharType="begin"/>
-            </w:r>
-            <w:r>
-              <w:rPr>
-                <w:noProof/>
-                <w:webHidden/>
-              </w:rPr>
               <w:instrText xml:space="preserve"> PAGEREF _Toc236651252 \h </w:instrText>
-            </w:r>
-            <w:r>
-              <w:rPr>
-                <w:noProof/>
-                <w:webHidden/>
-              </w:rPr>
-            </w:r>
-            <w:r>
-              <w:rPr>
-                <w:noProof/>
-                <w:webHidden/>
-              </w:rPr>
               <w:fldChar w:fldCharType="separate"/>
-            </w:r>
-            <w:r>
-              <w:rPr>
-                <w:noProof/>
-                <w:webHidden/>
-              </w:rPr>
               <w:t>4</w:t>
-            </w:r>
-            <w:r>
-              <w:rPr>
-                <w:noProof/>
-                <w:webHidden/>
-              </w:rPr>
               <w:fldChar w:fldCharType="end"/>
             </w:r>
           </w:hyperlink>
@@ -1034,46 +724,10 @@
                 <w:webHidden/>
               </w:rPr>
               <w:tab/>
-            </w:r>
-            <w:r>
-              <w:rPr>
-                <w:noProof/>
-                <w:webHidden/>
-              </w:rPr>
               <w:fldChar w:fldCharType="begin"/>
-            </w:r>
-            <w:r>
-              <w:rPr>
-                <w:noProof/>
-                <w:webHidden/>
-              </w:rPr>
               <w:instrText xml:space="preserve"> PAGEREF _Toc236651253 \h </w:instrText>
-            </w:r>
-            <w:r>
-              <w:rPr>
-                <w:noProof/>
-                <w:webHidden/>
-              </w:rPr>
-            </w:r>
-            <w:r>
-              <w:rPr>
-                <w:noProof/>
-                <w:webHidden/>
-              </w:rPr>
               <w:fldChar w:fldCharType="separate"/>
-            </w:r>
-            <w:r>
-              <w:rPr>
-                <w:noProof/>
-                <w:webHidden/>
-              </w:rPr>
               <w:t>4</w:t>
-            </w:r>
-            <w:r>
-              <w:rPr>
-                <w:noProof/>
-                <w:webHidden/>
-              </w:rPr>
               <w:fldChar w:fldCharType="end"/>
             </w:r>
           </w:hyperlink>
@@ -1109,46 +763,10 @@
                 <w:webHidden/>
               </w:rPr>
               <w:tab/>
-            </w:r>
-            <w:r>
-              <w:rPr>
-                <w:noProof/>
-                <w:webHidden/>
-              </w:rPr>
               <w:fldChar w:fldCharType="begin"/>
-            </w:r>
-            <w:r>
-              <w:rPr>
-                <w:noProof/>
-                <w:webHidden/>
-              </w:rPr>
               <w:instrText xml:space="preserve"> PAGEREF _Toc236651254 \h </w:instrText>
-            </w:r>
-            <w:r>
-              <w:rPr>
-                <w:noProof/>
-                <w:webHidden/>
-              </w:rPr>
-            </w:r>
-            <w:r>
-              <w:rPr>
-                <w:noProof/>
-                <w:webHidden/>
-              </w:rPr>
               <w:fldChar w:fldCharType="separate"/>
-            </w:r>
-            <w:r>
-              <w:rPr>
-                <w:noProof/>
-                <w:webHidden/>
-              </w:rPr>
               <w:t>5</w:t>
-            </w:r>
-            <w:r>
-              <w:rPr>
-                <w:noProof/>
-                <w:webHidden/>
-              </w:rPr>
               <w:fldChar w:fldCharType="end"/>
             </w:r>
           </w:hyperlink>
@@ -1184,46 +802,10 @@
                 <w:webHidden/>
               </w:rPr>
               <w:tab/>
-            </w:r>
-            <w:r>
-              <w:rPr>
-                <w:noProof/>
-                <w:webHidden/>
-              </w:rPr>
               <w:fldChar w:fldCharType="begin"/>
-            </w:r>
-            <w:r>
-              <w:rPr>
-                <w:noProof/>
-                <w:webHidden/>
-              </w:rPr>
               <w:instrText xml:space="preserve"> PAGEREF _Toc236651255 \h </w:instrText>
-            </w:r>
-            <w:r>
-              <w:rPr>
-                <w:noProof/>
-                <w:webHidden/>
-              </w:rPr>
-            </w:r>
-            <w:r>
-              <w:rPr>
-                <w:noProof/>
-                <w:webHidden/>
-              </w:rPr>
               <w:fldChar w:fldCharType="separate"/>
-            </w:r>
-            <w:r>
-              <w:rPr>
-                <w:noProof/>
-                <w:webHidden/>
-              </w:rPr>
               <w:t>5</w:t>
-            </w:r>
-            <w:r>
-              <w:rPr>
-                <w:noProof/>
-                <w:webHidden/>
-              </w:rPr>
               <w:fldChar w:fldCharType="end"/>
             </w:r>
           </w:hyperlink>
@@ -1259,46 +841,10 @@
                 <w:webHidden/>
               </w:rPr>
               <w:tab/>
-            </w:r>
-            <w:r>
-              <w:rPr>
-                <w:noProof/>
-                <w:webHidden/>
-              </w:rPr>
               <w:fldChar w:fldCharType="begin"/>
-            </w:r>
-            <w:r>
-              <w:rPr>
-                <w:noProof/>
-                <w:webHidden/>
-              </w:rPr>
               <w:instrText xml:space="preserve"> PAGEREF _Toc236651256 \h </w:instrText>
-            </w:r>
-            <w:r>
-              <w:rPr>
-                <w:noProof/>
-                <w:webHidden/>
-              </w:rPr>
-            </w:r>
-            <w:r>
-              <w:rPr>
-                <w:noProof/>
-                <w:webHidden/>
-              </w:rPr>
               <w:fldChar w:fldCharType="separate"/>
-            </w:r>
-            <w:r>
-              <w:rPr>
-                <w:noProof/>
-                <w:webHidden/>
-              </w:rPr>
               <w:t>9</w:t>
-            </w:r>
-            <w:r>
-              <w:rPr>
-                <w:noProof/>
-                <w:webHidden/>
-              </w:rPr>
               <w:fldChar w:fldCharType="end"/>
             </w:r>
           </w:hyperlink>
@@ -1334,46 +880,10 @@
                 <w:webHidden/>
               </w:rPr>
               <w:tab/>
-            </w:r>
-            <w:r>
-              <w:rPr>
-                <w:noProof/>
-                <w:webHidden/>
-              </w:rPr>
               <w:fldChar w:fldCharType="begin"/>
-            </w:r>
-            <w:r>
-              <w:rPr>
-                <w:noProof/>
-                <w:webHidden/>
-              </w:rPr>
               <w:instrText xml:space="preserve"> PAGEREF _Toc236651257 \h </w:instrText>
-            </w:r>
-            <w:r>
-              <w:rPr>
-                <w:noProof/>
-                <w:webHidden/>
-              </w:rPr>
-            </w:r>
-            <w:r>
-              <w:rPr>
-                <w:noProof/>
-                <w:webHidden/>
-              </w:rPr>
               <w:fldChar w:fldCharType="separate"/>
-            </w:r>
-            <w:r>
-              <w:rPr>
-                <w:noProof/>
-                <w:webHidden/>
-              </w:rPr>
               <w:t>9</w:t>
-            </w:r>
-            <w:r>
-              <w:rPr>
-                <w:noProof/>
-                <w:webHidden/>
-              </w:rPr>
               <w:fldChar w:fldCharType="end"/>
             </w:r>
           </w:hyperlink>
@@ -1409,46 +919,10 @@
                 <w:webHidden/>
               </w:rPr>
               <w:tab/>
-            </w:r>
-            <w:r>
-              <w:rPr>
-                <w:noProof/>
-                <w:webHidden/>
-              </w:rPr>
               <w:fldChar w:fldCharType="begin"/>
-            </w:r>
-            <w:r>
-              <w:rPr>
-                <w:noProof/>
-                <w:webHidden/>
-              </w:rPr>
               <w:instrText xml:space="preserve"> PAGEREF _Toc236651258 \h </w:instrText>
-            </w:r>
-            <w:r>
-              <w:rPr>
-                <w:noProof/>
-                <w:webHidden/>
-              </w:rPr>
-            </w:r>
-            <w:r>
-              <w:rPr>
-                <w:noProof/>
-                <w:webHidden/>
-              </w:rPr>
               <w:fldChar w:fldCharType="separate"/>
-            </w:r>
-            <w:r>
-              <w:rPr>
-                <w:noProof/>
-                <w:webHidden/>
-              </w:rPr>
               <w:t>9</w:t>
-            </w:r>
-            <w:r>
-              <w:rPr>
-                <w:noProof/>
-                <w:webHidden/>
-              </w:rPr>
               <w:fldChar w:fldCharType="end"/>
             </w:r>
           </w:hyperlink>
@@ -1484,46 +958,10 @@
                 <w:webHidden/>
               </w:rPr>
               <w:tab/>
-            </w:r>
-            <w:r>
-              <w:rPr>
-                <w:noProof/>
-                <w:webHidden/>
-              </w:rPr>
               <w:fldChar w:fldCharType="begin"/>
-            </w:r>
-            <w:r>
-              <w:rPr>
-                <w:noProof/>
-                <w:webHidden/>
-              </w:rPr>
               <w:instrText xml:space="preserve"> PAGEREF _Toc236651259 \h </w:instrText>
-            </w:r>
-            <w:r>
-              <w:rPr>
-                <w:noProof/>
-                <w:webHidden/>
-              </w:rPr>
-            </w:r>
-            <w:r>
-              <w:rPr>
-                <w:noProof/>
-                <w:webHidden/>
-              </w:rPr>
               <w:fldChar w:fldCharType="separate"/>
-            </w:r>
-            <w:r>
-              <w:rPr>
-                <w:noProof/>
-                <w:webHidden/>
-              </w:rPr>
               <w:t>9</w:t>
-            </w:r>
-            <w:r>
-              <w:rPr>
-                <w:noProof/>
-                <w:webHidden/>
-              </w:rPr>
               <w:fldChar w:fldCharType="end"/>
             </w:r>
           </w:hyperlink>
@@ -1559,46 +997,10 @@
                 <w:webHidden/>
               </w:rPr>
               <w:tab/>
-            </w:r>
-            <w:r>
-              <w:rPr>
-                <w:noProof/>
-                <w:webHidden/>
-              </w:rPr>
               <w:fldChar w:fldCharType="begin"/>
-            </w:r>
-            <w:r>
-              <w:rPr>
-                <w:noProof/>
-                <w:webHidden/>
-              </w:rPr>
               <w:instrText xml:space="preserve"> PAGEREF _Toc236651260 \h </w:instrText>
-            </w:r>
-            <w:r>
-              <w:rPr>
-                <w:noProof/>
-                <w:webHidden/>
-              </w:rPr>
-            </w:r>
-            <w:r>
-              <w:rPr>
-                <w:noProof/>
-                <w:webHidden/>
-              </w:rPr>
               <w:fldChar w:fldCharType="separate"/>
-            </w:r>
-            <w:r>
-              <w:rPr>
-                <w:noProof/>
-                <w:webHidden/>
-              </w:rPr>
               <w:t>10</w:t>
-            </w:r>
-            <w:r>
-              <w:rPr>
-                <w:noProof/>
-                <w:webHidden/>
-              </w:rPr>
               <w:fldChar w:fldCharType="end"/>
             </w:r>
           </w:hyperlink>
@@ -1634,46 +1036,10 @@
                 <w:webHidden/>
               </w:rPr>
               <w:tab/>
-            </w:r>
-            <w:r>
-              <w:rPr>
-                <w:noProof/>
-                <w:webHidden/>
-              </w:rPr>
               <w:fldChar w:fldCharType="begin"/>
-            </w:r>
-            <w:r>
-              <w:rPr>
-                <w:noProof/>
-                <w:webHidden/>
-              </w:rPr>
               <w:instrText xml:space="preserve"> PAGEREF _Toc236651261 \h </w:instrText>
-            </w:r>
-            <w:r>
-              <w:rPr>
-                <w:noProof/>
-                <w:webHidden/>
-              </w:rPr>
-            </w:r>
-            <w:r>
-              <w:rPr>
-                <w:noProof/>
-                <w:webHidden/>
-              </w:rPr>
               <w:fldChar w:fldCharType="separate"/>
-            </w:r>
-            <w:r>
-              <w:rPr>
-                <w:noProof/>
-                <w:webHidden/>
-              </w:rPr>
               <w:t>10</w:t>
-            </w:r>
-            <w:r>
-              <w:rPr>
-                <w:noProof/>
-                <w:webHidden/>
-              </w:rPr>
               <w:fldChar w:fldCharType="end"/>
             </w:r>
           </w:hyperlink>
@@ -1709,46 +1075,10 @@
                 <w:webHidden/>
               </w:rPr>
               <w:tab/>
-            </w:r>
-            <w:r>
-              <w:rPr>
-                <w:noProof/>
-                <w:webHidden/>
-              </w:rPr>
               <w:fldChar w:fldCharType="begin"/>
-            </w:r>
-            <w:r>
-              <w:rPr>
-                <w:noProof/>
-                <w:webHidden/>
-              </w:rPr>
               <w:instrText xml:space="preserve"> PAGEREF _Toc236651262 \h </w:instrText>
-            </w:r>
-            <w:r>
-              <w:rPr>
-                <w:noProof/>
-                <w:webHidden/>
-              </w:rPr>
-            </w:r>
-            <w:r>
-              <w:rPr>
-                <w:noProof/>
-                <w:webHidden/>
-              </w:rPr>
               <w:fldChar w:fldCharType="separate"/>
-            </w:r>
-            <w:r>
-              <w:rPr>
-                <w:noProof/>
-                <w:webHidden/>
-              </w:rPr>
               <w:t>10</w:t>
-            </w:r>
-            <w:r>
-              <w:rPr>
-                <w:noProof/>
-                <w:webHidden/>
-              </w:rPr>
               <w:fldChar w:fldCharType="end"/>
             </w:r>
           </w:hyperlink>
@@ -1784,46 +1114,10 @@
                 <w:webHidden/>
               </w:rPr>
               <w:tab/>
-            </w:r>
-            <w:r>
-              <w:rPr>
-                <w:noProof/>
-                <w:webHidden/>
-              </w:rPr>
               <w:fldChar w:fldCharType="begin"/>
-            </w:r>
-            <w:r>
-              <w:rPr>
-                <w:noProof/>
-                <w:webHidden/>
-              </w:rPr>
               <w:instrText xml:space="preserve"> PAGEREF _Toc236651263 \h </w:instrText>
-            </w:r>
-            <w:r>
-              <w:rPr>
-                <w:noProof/>
-                <w:webHidden/>
-              </w:rPr>
-            </w:r>
-            <w:r>
-              <w:rPr>
-                <w:noProof/>
-                <w:webHidden/>
-              </w:rPr>
               <w:fldChar w:fldCharType="separate"/>
-            </w:r>
-            <w:r>
-              <w:rPr>
-                <w:noProof/>
-                <w:webHidden/>
-              </w:rPr>
               <w:t>10</w:t>
-            </w:r>
-            <w:r>
-              <w:rPr>
-                <w:noProof/>
-                <w:webHidden/>
-              </w:rPr>
               <w:fldChar w:fldCharType="end"/>
             </w:r>
           </w:hyperlink>
@@ -1859,46 +1153,10 @@
                 <w:webHidden/>
               </w:rPr>
               <w:tab/>
-            </w:r>
-            <w:r>
-              <w:rPr>
-                <w:noProof/>
-                <w:webHidden/>
-              </w:rPr>
               <w:fldChar w:fldCharType="begin"/>
-            </w:r>
-            <w:r>
-              <w:rPr>
-                <w:noProof/>
-                <w:webHidden/>
-              </w:rPr>
               <w:instrText xml:space="preserve"> PAGEREF _Toc236651264 \h </w:instrText>
-            </w:r>
-            <w:r>
-              <w:rPr>
-                <w:noProof/>
-                <w:webHidden/>
-              </w:rPr>
-            </w:r>
-            <w:r>
-              <w:rPr>
-                <w:noProof/>
-                <w:webHidden/>
-              </w:rPr>
               <w:fldChar w:fldCharType="separate"/>
-            </w:r>
-            <w:r>
-              <w:rPr>
-                <w:noProof/>
-                <w:webHidden/>
-              </w:rPr>
               <w:t>11</w:t>
-            </w:r>
-            <w:r>
-              <w:rPr>
-                <w:noProof/>
-                <w:webHidden/>
-              </w:rPr>
               <w:fldChar w:fldCharType="end"/>
             </w:r>
           </w:hyperlink>
@@ -1934,46 +1192,10 @@
                 <w:webHidden/>
               </w:rPr>
               <w:tab/>
-            </w:r>
-            <w:r>
-              <w:rPr>
-                <w:noProof/>
-                <w:webHidden/>
-              </w:rPr>
               <w:fldChar w:fldCharType="begin"/>
-            </w:r>
-            <w:r>
-              <w:rPr>
-                <w:noProof/>
-                <w:webHidden/>
-              </w:rPr>
               <w:instrText xml:space="preserve"> PAGEREF _Toc236651265 \h </w:instrText>
-            </w:r>
-            <w:r>
-              <w:rPr>
-                <w:noProof/>
-                <w:webHidden/>
-              </w:rPr>
-            </w:r>
-            <w:r>
-              <w:rPr>
-                <w:noProof/>
-                <w:webHidden/>
-              </w:rPr>
               <w:fldChar w:fldCharType="separate"/>
-            </w:r>
-            <w:r>
-              <w:rPr>
-                <w:noProof/>
-                <w:webHidden/>
-              </w:rPr>
               <w:t>11</w:t>
-            </w:r>
-            <w:r>
-              <w:rPr>
-                <w:noProof/>
-                <w:webHidden/>
-              </w:rPr>
               <w:fldChar w:fldCharType="end"/>
             </w:r>
           </w:hyperlink>
@@ -2009,46 +1231,10 @@
                 <w:webHidden/>
               </w:rPr>
               <w:tab/>
-            </w:r>
-            <w:r>
-              <w:rPr>
-                <w:noProof/>
-                <w:webHidden/>
-              </w:rPr>
               <w:fldChar w:fldCharType="begin"/>
-            </w:r>
-            <w:r>
-              <w:rPr>
-                <w:noProof/>
-                <w:webHidden/>
-              </w:rPr>
               <w:instrText xml:space="preserve"> PAGEREF _Toc236651266 \h </w:instrText>
-            </w:r>
-            <w:r>
-              <w:rPr>
-                <w:noProof/>
-                <w:webHidden/>
-              </w:rPr>
-            </w:r>
-            <w:r>
-              <w:rPr>
-                <w:noProof/>
-                <w:webHidden/>
-              </w:rPr>
               <w:fldChar w:fldCharType="separate"/>
-            </w:r>
-            <w:r>
-              <w:rPr>
-                <w:noProof/>
-                <w:webHidden/>
-              </w:rPr>
               <w:t>11</w:t>
-            </w:r>
-            <w:r>
-              <w:rPr>
-                <w:noProof/>
-                <w:webHidden/>
-              </w:rPr>
               <w:fldChar w:fldCharType="end"/>
             </w:r>
           </w:hyperlink>
@@ -2084,46 +1270,10 @@
                 <w:webHidden/>
               </w:rPr>
               <w:tab/>
-            </w:r>
-            <w:r>
-              <w:rPr>
-                <w:noProof/>
-                <w:webHidden/>
-              </w:rPr>
               <w:fldChar w:fldCharType="begin"/>
-            </w:r>
-            <w:r>
-              <w:rPr>
-                <w:noProof/>
-                <w:webHidden/>
-              </w:rPr>
               <w:instrText xml:space="preserve"> PAGEREF _Toc236651267 \h </w:instrText>
-            </w:r>
-            <w:r>
-              <w:rPr>
-                <w:noProof/>
-                <w:webHidden/>
-              </w:rPr>
-            </w:r>
-            <w:r>
-              <w:rPr>
-                <w:noProof/>
-                <w:webHidden/>
-              </w:rPr>
               <w:fldChar w:fldCharType="separate"/>
-            </w:r>
-            <w:r>
-              <w:rPr>
-                <w:noProof/>
-                <w:webHidden/>
-              </w:rPr>
               <w:t>11</w:t>
-            </w:r>
-            <w:r>
-              <w:rPr>
-                <w:noProof/>
-                <w:webHidden/>
-              </w:rPr>
               <w:fldChar w:fldCharType="end"/>
             </w:r>
           </w:hyperlink>
@@ -2159,46 +1309,10 @@
                 <w:webHidden/>
               </w:rPr>
               <w:tab/>
-            </w:r>
-            <w:r>
-              <w:rPr>
-                <w:noProof/>
-                <w:webHidden/>
-              </w:rPr>
               <w:fldChar w:fldCharType="begin"/>
-            </w:r>
-            <w:r>
-              <w:rPr>
-                <w:noProof/>
-                <w:webHidden/>
-              </w:rPr>
               <w:instrText xml:space="preserve"> PAGEREF _Toc236651268 \h </w:instrText>
-            </w:r>
-            <w:r>
-              <w:rPr>
-                <w:noProof/>
-                <w:webHidden/>
-              </w:rPr>
-            </w:r>
-            <w:r>
-              <w:rPr>
-                <w:noProof/>
-                <w:webHidden/>
-              </w:rPr>
               <w:fldChar w:fldCharType="separate"/>
-            </w:r>
-            <w:r>
-              <w:rPr>
-                <w:noProof/>
-                <w:webHidden/>
-              </w:rPr>
               <w:t>12</w:t>
-            </w:r>
-            <w:r>
-              <w:rPr>
-                <w:noProof/>
-                <w:webHidden/>
-              </w:rPr>
               <w:fldChar w:fldCharType="end"/>
             </w:r>
           </w:hyperlink>
@@ -2284,71 +1398,7 @@
         <w:rPr>
           <w:color w:val="222222"/>
         </w:rPr>
-        <w:t xml:space="preserve">This session extended the Project 3 motor-control platform by replacing the point-to-point ESP-NOW link with an MQTT publish/subscribe architecture, using the same conceptual "pairing" idea from the ESP-NOW exercise: two ESP32 boards, owned by two different students, communicate indirectly through a shared broker instead of a direct MAC-address link. Before writing any firmware, the pairing was first rehearsed manually using a web-based MQTT client to connect to a public broker and exchange a </w:t>
-      </w:r>
-      <w:proofErr w:type="gramStart"/>
-      <w:r>
-        <w:rPr>
-          <w:color w:val="222222"/>
-        </w:rPr>
-        <w:t>publish</w:t>
-      </w:r>
-      <w:proofErr w:type="gramEnd"/>
-      <w:r>
-        <w:rPr>
-          <w:color w:val="222222"/>
-        </w:rPr>
-        <w:t xml:space="preserve"> and a </w:t>
-      </w:r>
-      <w:proofErr w:type="gramStart"/>
-      <w:r>
-        <w:rPr>
-          <w:color w:val="222222"/>
-        </w:rPr>
-        <w:t>subscribe by hand</w:t>
-      </w:r>
-      <w:proofErr w:type="gramEnd"/>
-      <w:r>
-        <w:rPr>
-          <w:color w:val="222222"/>
-        </w:rPr>
-        <w:t xml:space="preserve">, exactly as covered in the Day 11 notes. Only after that hands-on step did the two boards get programmed: Board A carries an IR obstacle </w:t>
-      </w:r>
-      <w:proofErr w:type="gramStart"/>
-      <w:r>
-        <w:rPr>
-          <w:color w:val="222222"/>
-        </w:rPr>
-        <w:t>sensor</w:t>
-      </w:r>
-      <w:proofErr w:type="gramEnd"/>
-      <w:r>
-        <w:rPr>
-          <w:color w:val="222222"/>
-        </w:rPr>
-        <w:t xml:space="preserve"> and Board B carries the L298N-driven DC motor. A public MQTT broker (broker.emqx.io, with </w:t>
-      </w:r>
-      <w:proofErr w:type="spellStart"/>
-      <w:proofErr w:type="gramStart"/>
-      <w:r>
-        <w:rPr>
-          <w:color w:val="222222"/>
-        </w:rPr>
-        <w:t>iot.coreflux</w:t>
-      </w:r>
-      <w:proofErr w:type="gramEnd"/>
-      <w:r>
-        <w:rPr>
-          <w:color w:val="222222"/>
-        </w:rPr>
-        <w:t>.cloud</w:t>
-      </w:r>
-      <w:proofErr w:type="spellEnd"/>
-      <w:r>
-        <w:rPr>
-          <w:color w:val="222222"/>
-        </w:rPr>
-        <w:t xml:space="preserve"> as an alternative) replaces the private local broker used in early experiments, so the pairing works over the open internet rather than only on a local Wi-Fi network.</w:t>
+        <w:t xml:space="preserve">This session extended the Project 3 motor-control platform by replacing the point-to-point ESP-NOW link with an MQTT publish/subscribe architecture, using the same conceptual "pairing" idea from the ESP-NOW exercise: two ESP32 boards, owned by two different students, communicate indirectly through a shared broker instead of a direct MAC-address link. Before writing any firmware, the pairing was first rehearsed manually using a web-based MQTT client to connect to a public broker and exchange a publish and a subscribe by hand, exactly as covered in the Day 11 notes. Only after that hands-on step did the two boards get programmed: Board A and Board B are built identically, each carrying its own IR obstacle sensor and its own L298N-driven DC motor, so that either student's sensor reading can control the other student's motor. A public MQTT broker (broker.emqx.io, with iot.coreflux.cloud as an alternative) replaces the private local broker used in early experiments, so the pairing works over the open internet rather than only on a local Wi-Fi network.</w:t>
       </w:r>
     </w:p>
     <w:p>
@@ -2359,49 +1409,7 @@
         <w:rPr>
           <w:color w:val="222222"/>
         </w:rPr>
-        <w:t xml:space="preserve">Unlike a one-way sensor-to-motor link, this pairing uses two separate topics so that both boards act as publisher and subscriber at the same time: each board publishes its own status on one topic and listens for its partner's status on the other topic. The firmware keeps the modular, object-oriented structure established in Project 3: a dedicated MQTT class wraps the </w:t>
-      </w:r>
-      <w:proofErr w:type="spellStart"/>
-      <w:r>
-        <w:rPr>
-          <w:color w:val="222222"/>
-        </w:rPr>
-        <w:t>WiFiClient</w:t>
-      </w:r>
-      <w:proofErr w:type="spellEnd"/>
-      <w:r>
-        <w:rPr>
-          <w:color w:val="222222"/>
-        </w:rPr>
-        <w:t>/</w:t>
-      </w:r>
-      <w:proofErr w:type="spellStart"/>
-      <w:r>
-        <w:rPr>
-          <w:color w:val="222222"/>
-        </w:rPr>
-        <w:t>PubSubClient</w:t>
-      </w:r>
-      <w:proofErr w:type="spellEnd"/>
-      <w:r>
-        <w:rPr>
-          <w:color w:val="222222"/>
-        </w:rPr>
-        <w:t xml:space="preserve"> stack, a </w:t>
-      </w:r>
-      <w:proofErr w:type="spellStart"/>
-      <w:r>
-        <w:rPr>
-          <w:color w:val="222222"/>
-        </w:rPr>
-        <w:t>config.h</w:t>
-      </w:r>
-      <w:proofErr w:type="spellEnd"/>
-      <w:r>
-        <w:rPr>
-          <w:color w:val="222222"/>
-        </w:rPr>
-        <w:t xml:space="preserve"> header centralizes every credential, pin, topic string, and timing constant, and the existing L298N class is reused unchanged for motor direction and speed control. A software watchdog — a simple time-based timeout — was added so the motor is forced to stop automatically if updates from the partner board stop arriving, protecting against a lost Wi-Fi link, a dead broker connection, or a crashed partner board.</w:t>
+        <w:t xml:space="preserve">Unlike a one-way sensor-to-motor link, this pairing uses two separate topics so that both boards act as publisher and subscriber at the same time: each board publishes its own IR sensor reading on one topic and listens for its partner's IR sensor reading on the other topic, using that reading to control its own, locally-attached motor. The firmware keeps the modular, object-oriented structure established in Project 3: a dedicated MQTT class wraps the WiFiClient/PubSubClient stack, a config.h header centralizes every credential, pin, topic string, and timing constant, and the existing L298N class is reused unchanged for motor direction and speed control. A software watchdog — a simple time-based timeout — was added so the motor is forced to stop automatically if updates from the partner board stop arriving, protecting against a lost Wi-Fi link, a dead broker connection, or a crashed partner board.</w:t>
       </w:r>
     </w:p>
     <w:p>
@@ -2531,21 +1539,7 @@
         <w:rPr>
           <w:color w:val="222222"/>
         </w:rPr>
-        <w:t xml:space="preserve">Added a topic guard inside the incoming-message handler so each board reacts only to messages arriving on the topic it is </w:t>
-      </w:r>
-      <w:proofErr w:type="gramStart"/>
-      <w:r>
-        <w:rPr>
-          <w:color w:val="222222"/>
-        </w:rPr>
-        <w:t>actually subscribed</w:t>
-      </w:r>
-      <w:proofErr w:type="gramEnd"/>
-      <w:r>
-        <w:rPr>
-          <w:color w:val="222222"/>
-        </w:rPr>
-        <w:t xml:space="preserve"> to, ignoring anything else.</w:t>
+        <w:t xml:space="preserve">Added a topic guard inside the incoming-message handler so each board reacts only to messages arriving on the topic it is actually subscribed to, ignoring anything else.</w:t>
       </w:r>
     </w:p>
     <w:p>
@@ -2561,7 +1555,7 @@
         <w:rPr>
           <w:color w:val="222222"/>
         </w:rPr>
-        <w:t>Wrote the application logic for the motor board: the incoming-message handler drives the motor forward or stops it based on the received value, and a detection-timeout watchdog forces a safety stop if no message is received within two seconds.</w:t>
+        <w:t>Wrote the application logic for each board: the incoming-message handler stops the board's own motor when the partner's IR sensor reports a detected object, and drives it forward when the partner reports a clear path, and a detection-timeout watchdog forces a safety stop if no message is received within two seconds.</w:t>
       </w:r>
     </w:p>
     <w:p>
@@ -2639,63 +1633,7 @@
         <w:rPr>
           <w:color w:val="222222"/>
         </w:rPr>
-        <w:t xml:space="preserve">This is a fundamentally different mindset from the request/response style used by protocols such as HTTP. In HTTP, a client asks a server a question and waits for an answer. In MQTT, a client publishes a piece of information once, and the broker pushes it out automatically to anyone who has expressed </w:t>
-      </w:r>
-      <w:proofErr w:type="gramStart"/>
-      <w:r>
-        <w:rPr>
-          <w:color w:val="222222"/>
-        </w:rPr>
-        <w:t>interest —</w:t>
-      </w:r>
-      <w:proofErr w:type="gramEnd"/>
-      <w:r>
-        <w:rPr>
-          <w:color w:val="222222"/>
-        </w:rPr>
-        <w:t xml:space="preserve"> </w:t>
-      </w:r>
-      <w:proofErr w:type="gramStart"/>
-      <w:r>
-        <w:rPr>
-          <w:color w:val="222222"/>
-        </w:rPr>
-        <w:t>no</w:t>
-      </w:r>
-      <w:proofErr w:type="gramEnd"/>
-      <w:r>
-        <w:rPr>
-          <w:color w:val="222222"/>
-        </w:rPr>
-        <w:t xml:space="preserve"> one </w:t>
-      </w:r>
-      <w:proofErr w:type="gramStart"/>
-      <w:r>
-        <w:rPr>
-          <w:color w:val="222222"/>
-        </w:rPr>
-        <w:t>has to</w:t>
-      </w:r>
-      <w:proofErr w:type="gramEnd"/>
-      <w:r>
-        <w:rPr>
-          <w:color w:val="222222"/>
-        </w:rPr>
-        <w:t xml:space="preserve"> ask for it </w:t>
-      </w:r>
-      <w:proofErr w:type="gramStart"/>
-      <w:r>
-        <w:rPr>
-          <w:color w:val="222222"/>
-        </w:rPr>
-        <w:t>again and again</w:t>
-      </w:r>
-      <w:proofErr w:type="gramEnd"/>
-      <w:r>
-        <w:rPr>
-          <w:color w:val="222222"/>
-        </w:rPr>
-        <w:t>. This is why MQTT is described as event-driven rather than request-driven, and it is exactly the behavior this pairing relies on: as soon as the IR sensor state changes, the update reaches the motor board automatically, with no polling required.</w:t>
+        <w:t xml:space="preserve">This is a fundamentally different mindset from the request/response style used by protocols such as HTTP. In HTTP, a client asks a server a question and waits for an answer. In MQTT, a client publishes a piece of information once, and the broker pushes it out automatically to anyone who has expressed interest — no one has to ask for it again and again. This is why MQTT is described as event-driven rather than request-driven, and it is exactly the behavior this pairing relies on: as soon as the IR sensor state changes, the update reaches the motor board automatically, with no polling required.</w:t>
       </w:r>
     </w:p>
     <w:p>
@@ -2724,35 +1662,7 @@
         <w:rPr>
           <w:color w:val="222222"/>
         </w:rPr>
-        <w:t xml:space="preserve">MQTT organizes communication around three simple actions. Publishing means a client sends a message to a named address, called a topic. Subscribing means a client tells the broker </w:t>
-      </w:r>
-      <w:proofErr w:type="gramStart"/>
-      <w:r>
-        <w:rPr>
-          <w:color w:val="222222"/>
-        </w:rPr>
-        <w:t>"send</w:t>
-      </w:r>
-      <w:proofErr w:type="gramEnd"/>
-      <w:r>
-        <w:rPr>
-          <w:color w:val="222222"/>
-        </w:rPr>
-        <w:t xml:space="preserve"> me every future message sent to this topic." The broker's job is to receive every </w:t>
-      </w:r>
-      <w:proofErr w:type="gramStart"/>
-      <w:r>
-        <w:rPr>
-          <w:color w:val="222222"/>
-        </w:rPr>
-        <w:t>publish</w:t>
-      </w:r>
-      <w:proofErr w:type="gramEnd"/>
-      <w:r>
-        <w:rPr>
-          <w:color w:val="222222"/>
-        </w:rPr>
-        <w:t>, look up who is currently subscribed to that exact topic, and forward the message to each of them. A topic is not a physical thing and does not need to be created in advance — it simply comes into existence the moment any client publishes to it or subscribes to it, and it disappears again once nobody is using it.</w:t>
+        <w:t xml:space="preserve">MQTT organizes communication around three simple actions. Publishing means a client sends a message to a named address, called a topic. Subscribing means a client tells the broker "send me every future message sent to this topic." The broker's job is to receive every publish, look up who is currently subscribed to that exact topic, and forward the message to each of them. A topic is not a physical thing and does not need to be created in advance — it simply comes into existence the moment any client publishes to it or subscribes to it, and it disappears again once nobody is using it.</w:t>
       </w:r>
     </w:p>
     <w:p>
@@ -2958,25 +1868,7 @@
                 <w:sz w:val="19"/>
                 <w:szCs w:val="19"/>
               </w:rPr>
-              <w:t xml:space="preserve">The software service (not a router or piece of hardware) that receives every </w:t>
-            </w:r>
-            <w:proofErr w:type="gramStart"/>
-            <w:r>
-              <w:rPr>
-                <w:color w:val="222222"/>
-                <w:sz w:val="19"/>
-                <w:szCs w:val="19"/>
-              </w:rPr>
-              <w:t>publish</w:t>
-            </w:r>
-            <w:proofErr w:type="gramEnd"/>
-            <w:r>
-              <w:rPr>
-                <w:color w:val="222222"/>
-                <w:sz w:val="19"/>
-                <w:szCs w:val="19"/>
-              </w:rPr>
-              <w:t xml:space="preserve"> and forwards it to the correct subscribers</w:t>
+              <w:t xml:space="preserve">The software service (not a router or piece of hardware) that receives every publish and forwards it to the correct subscribers</w:t>
             </w:r>
           </w:p>
         </w:tc>
@@ -3225,11 +2117,6 @@
           <w:color w:val="222222"/>
         </w:rPr>
         <w:t xml:space="preserve">MQTT does not avoid the normal network stack — it still runs on top of Wi-Fi, IP, and TCP, and it can optionally add TLS encryption on top of that, exactly like most other internet protocols. What makes it lightweight is the size of the MQTT layer itself: its fixed header can be as small as two bytes, compared to an </w:t>
-      </w:r>
-      <w:r>
-        <w:rPr>
-          <w:color w:val="222222"/>
-        </w:rPr>
         <w:lastRenderedPageBreak/>
         <w:t>HTTP request which carries a method, a URL, a version string, a host, and a full set of headers before the actual data even begins. For a microcontroller sending a short reading many times per second, that difference in overhead is significant, both in bandwidth and in the processing needed to build and parse each message.</w:t>
       </w:r>
@@ -3942,21 +2829,7 @@
         <w:rPr>
           <w:color w:val="222222"/>
         </w:rPr>
-        <w:t xml:space="preserve">A browser-based MQTT client — MQTTX Web Client, available at </w:t>
-      </w:r>
-      <w:proofErr w:type="spellStart"/>
-      <w:r>
-        <w:rPr>
-          <w:color w:val="222222"/>
-        </w:rPr>
-        <w:t>mqttx.app</w:t>
-      </w:r>
-      <w:proofErr w:type="spellEnd"/>
-      <w:r>
-        <w:rPr>
-          <w:color w:val="222222"/>
-        </w:rPr>
-        <w:t>/web-client — was opened and used purely as a manual publisher/subscriber, with no code involved at this stage — its only job was to connect to the same public broker the boards would later use.</w:t>
+        <w:t xml:space="preserve">A browser-based MQTT client — MQTTX Web Client, available at mqttx.app/web-client — was opened and used purely as a manual publisher/subscriber, with no code involved at this stage — its only job was to connect to the same public broker the boards would later use.</w:t>
       </w:r>
     </w:p>
     <w:p>
@@ -4019,21 +2892,7 @@
         <w:rPr>
           <w:color w:val="222222"/>
         </w:rPr>
-        <w:t xml:space="preserve">A client identifier was set (or left </w:t>
-      </w:r>
-      <w:proofErr w:type="gramStart"/>
-      <w:r>
-        <w:rPr>
-          <w:color w:val="222222"/>
-        </w:rPr>
-        <w:t>auto-generated</w:t>
-      </w:r>
-      <w:proofErr w:type="gramEnd"/>
-      <w:r>
-        <w:rPr>
-          <w:color w:val="222222"/>
-        </w:rPr>
-        <w:t>) so the broker could tell this connection apart from any other client</w:t>
+        <w:t xml:space="preserve">A client identifier was set (or left auto-generated) so the broker could tell this connection apart from any other client</w:t>
       </w:r>
     </w:p>
     <w:p>
@@ -4075,21 +2934,7 @@
         <w:rPr>
           <w:color w:val="222222"/>
         </w:rPr>
-        <w:t xml:space="preserve">Clicking Connect performed the same handshake the firmware </w:t>
-      </w:r>
-      <w:proofErr w:type="gramStart"/>
-      <w:r>
-        <w:rPr>
-          <w:color w:val="222222"/>
-        </w:rPr>
-        <w:t>performs</w:t>
-      </w:r>
-      <w:proofErr w:type="gramEnd"/>
-      <w:r>
-        <w:rPr>
-          <w:color w:val="222222"/>
-        </w:rPr>
-        <w:t xml:space="preserve"> later: the client opened a network connection to the broker and the broker acknowledged it, after which the client's status changed from disconnected to connected.</w:t>
+        <w:t xml:space="preserve">Clicking Connect performed the same handshake the firmware performs later: the client opened a network connection to the broker and the broker acknowledged it, after which the client's status changed from disconnected to connected.</w:t>
       </w:r>
     </w:p>
     <w:p>
@@ -4173,21 +3018,7 @@
         <w:rPr>
           <w:color w:val="222222"/>
         </w:rPr>
-        <w:t xml:space="preserve">The </w:t>
-      </w:r>
-      <w:proofErr w:type="gramStart"/>
-      <w:r>
-        <w:rPr>
-          <w:color w:val="222222"/>
-        </w:rPr>
-        <w:t>received message</w:t>
-      </w:r>
-      <w:proofErr w:type="gramEnd"/>
-      <w:r>
-        <w:rPr>
-          <w:color w:val="222222"/>
-        </w:rPr>
-        <w:t xml:space="preserve"> showed the topic, the payload, and the time it arrived — confirming the broker delivers the message, not just an acknowledgement</w:t>
+        <w:t xml:space="preserve">The received message showed the topic, the payload, and the time it arrived — confirming the broker delivers the message, not just an acknowledgement</w:t>
       </w:r>
     </w:p>
     <w:p>
@@ -4199,19 +3030,11 @@
         </w:numPr>
         <w:spacing w:after="90"/>
       </w:pPr>
-      <w:proofErr w:type="gramStart"/>
-      <w:r>
-        <w:rPr>
-          <w:color w:val="222222"/>
-        </w:rPr>
-        <w:t>Publishing to</w:t>
-      </w:r>
-      <w:proofErr w:type="gramEnd"/>
-      <w:r>
-        <w:rPr>
-          <w:color w:val="222222"/>
-        </w:rPr>
-        <w:t xml:space="preserve"> a different, unrelated topic while still subscribed to the original one produced no message, confirming that delivery is strictly topic-based</w:t>
+      <w:r>
+        <w:rPr>
+          <w:color w:val="222222"/>
+        </w:rPr>
+        <w:t xml:space="preserve">Publishing to a different, unrelated topic while still subscribed to the original one produced no message, confirming that delivery is strictly topic-based</w:t>
       </w:r>
     </w:p>
     <w:p>
@@ -4227,35 +3050,7 @@
         <w:rPr>
           <w:color w:val="222222"/>
         </w:rPr>
-        <w:t xml:space="preserve">Only after this manual exchange behaved as expected did the exercise move on to writing firmware that performs the same </w:t>
-      </w:r>
-      <w:proofErr w:type="gramStart"/>
-      <w:r>
-        <w:rPr>
-          <w:color w:val="222222"/>
-        </w:rPr>
-        <w:t>publish</w:t>
-      </w:r>
-      <w:proofErr w:type="gramEnd"/>
-      <w:r>
-        <w:rPr>
-          <w:color w:val="222222"/>
-        </w:rPr>
-        <w:t xml:space="preserve"> and </w:t>
-      </w:r>
-      <w:proofErr w:type="gramStart"/>
-      <w:r>
-        <w:rPr>
-          <w:color w:val="222222"/>
-        </w:rPr>
-        <w:t>subscribe</w:t>
-      </w:r>
-      <w:proofErr w:type="gramEnd"/>
-      <w:r>
-        <w:rPr>
-          <w:color w:val="222222"/>
-        </w:rPr>
-        <w:t xml:space="preserve"> actions automatically</w:t>
+        <w:t xml:space="preserve">Only after this manual exchange behaved as expected did the exercise move on to writing firmware that performs the same publish and subscribe actions automatically</w:t>
       </w:r>
     </w:p>
     <w:p>
@@ -4281,49 +3076,7 @@
         <w:rPr>
           <w:color w:val="222222"/>
         </w:rPr>
-        <w:t>With the manual exchange confirmed, a small ESP32 sketch was flashed to replace the human publisher with real firmware. This is the exact sketch used to test against the MQTTX Web Client (</w:t>
-      </w:r>
-      <w:proofErr w:type="spellStart"/>
-      <w:r>
-        <w:rPr>
-          <w:color w:val="222222"/>
-        </w:rPr>
-        <w:t>mqttx.app</w:t>
-      </w:r>
-      <w:proofErr w:type="spellEnd"/>
-      <w:r>
-        <w:rPr>
-          <w:color w:val="222222"/>
-        </w:rPr>
-        <w:t xml:space="preserve">/web-client): the board connected to Wi-Fi, connected to the same public broker (broker.emqx.io, port 8884) as an MQTT client identified as ESP32_1, and published a single message to the topic esp32/test as soon as the connection succeeded. The web </w:t>
-      </w:r>
-      <w:proofErr w:type="gramStart"/>
-      <w:r>
-        <w:rPr>
-          <w:color w:val="222222"/>
-        </w:rPr>
-        <w:t>client stayed</w:t>
-      </w:r>
-      <w:proofErr w:type="gramEnd"/>
-      <w:r>
-        <w:rPr>
-          <w:color w:val="222222"/>
-        </w:rPr>
-        <w:t xml:space="preserve"> subscribed to that same topic throughout, exactly as in Step 4, so it could pick up the firmware's </w:t>
-      </w:r>
-      <w:proofErr w:type="gramStart"/>
-      <w:r>
-        <w:rPr>
-          <w:color w:val="222222"/>
-        </w:rPr>
-        <w:t>publish</w:t>
-      </w:r>
-      <w:proofErr w:type="gramEnd"/>
-      <w:r>
-        <w:rPr>
-          <w:color w:val="222222"/>
-        </w:rPr>
-        <w:t xml:space="preserve"> the moment it arrived — no other configuration was changed between the manual test and this firmware test.</w:t>
+        <w:t xml:space="preserve">With the manual exchange confirmed, a small ESP32 sketch was flashed to replace the human publisher with real firmware. This is the exact sketch used to test against the MQTTX Web Client (mqttx.app/web-client): the board connected to Wi-Fi, connected to the same public broker (broker.emqx.io, port 8884) as an MQTT client identified as ESP32_1, and published a single message to the topic esp32/test as soon as the connection succeeded. The web client stayed subscribed to that same topic throughout, exactly as in Step 4, so it could pick up the firmware's publish the moment it arrived — no other configuration was changed between the manual test and this firmware test.</w:t>
       </w:r>
     </w:p>
     <w:p>
@@ -4394,29 +3147,7 @@
           <w:sz w:val="18"/>
           <w:szCs w:val="18"/>
         </w:rPr>
-        <w:t>Result: the MQTTX Web Client (</w:t>
-      </w:r>
-      <w:proofErr w:type="spellStart"/>
-      <w:r>
-        <w:rPr>
-          <w:i/>
-          <w:iCs/>
-          <w:color w:val="595959"/>
-          <w:sz w:val="18"/>
-          <w:szCs w:val="18"/>
-        </w:rPr>
-        <w:t>mqttx.app</w:t>
-      </w:r>
-      <w:proofErr w:type="spellEnd"/>
-      <w:r>
-        <w:rPr>
-          <w:i/>
-          <w:iCs/>
-          <w:color w:val="595959"/>
-          <w:sz w:val="18"/>
-          <w:szCs w:val="18"/>
-        </w:rPr>
-        <w:t>/web-client), connection "malak_esp32_111", still subscribed to esp32/test, receiving the message published by the ESP32 firmware — payload "Hello from ESP32", QoS 0, marked Retained, timestamped 2026-08-02 12:23:38.</w:t>
+        <w:t>Result: the MQTTX Web Client (mqttx.app/web-client), connection "malak_esp32_111", still subscribed to esp32/test, receiving the message published by the ESP32 firmware — payload "Hello from ESP32", QoS 0, marked Retained, timestamped 2026-08-02 12:23:38.</w:t>
       </w:r>
     </w:p>
     <w:p>
@@ -4449,21 +3180,7 @@
           <w:color w:val="222222"/>
         </w:rPr>
         <w:lastRenderedPageBreak/>
-        <w:t xml:space="preserve">The Retained badge indicates the broker stored this message as the last known value for esp32/test — any client subscribing to that topic afterwards receives it immediately, even without a new </w:t>
-      </w:r>
-      <w:proofErr w:type="gramStart"/>
-      <w:r>
-        <w:rPr>
-          <w:color w:val="222222"/>
-        </w:rPr>
-        <w:t>publish</w:t>
-      </w:r>
-      <w:proofErr w:type="gramEnd"/>
-      <w:r>
-        <w:rPr>
-          <w:color w:val="222222"/>
-        </w:rPr>
-        <w:t>, which is a useful property for a status-style topic</w:t>
+        <w:t xml:space="preserve">The Retained badge indicates the broker stored this message as the last known value for esp32/test — any client subscribing to that topic afterwards receives it immediately, even without a new publish, which is a useful property for a status-style topic</w:t>
       </w:r>
     </w:p>
     <w:p>
@@ -4505,21 +3222,7 @@
         <w:rPr>
           <w:color w:val="222222"/>
         </w:rPr>
-        <w:t xml:space="preserve">The exact sketch flashed for this test is listed below, followed by a line-by-line breakdown. This is a minimal, publish-only sketch used purely to validate the connection and the publish path; it is not the final two-topic pairing firmware described in Section 4, which adds the MQTT class, </w:t>
-      </w:r>
-      <w:proofErr w:type="spellStart"/>
-      <w:r>
-        <w:rPr>
-          <w:color w:val="222222"/>
-        </w:rPr>
-        <w:t>config.h</w:t>
-      </w:r>
-      <w:proofErr w:type="spellEnd"/>
-      <w:r>
-        <w:rPr>
-          <w:color w:val="222222"/>
-        </w:rPr>
-        <w:t>, subscribing, and the message-received handler.</w:t>
+        <w:t xml:space="preserve">The exact sketch flashed for this test is listed below, followed by a line-by-line breakdown. This is a minimal, publish-only sketch used purely to validate the connection and the publish path; it is not the final two-topic pairing firmware described in Section 4, which adds the MQTT class, config.h, subscribing, and the message-received handler.</w:t>
       </w:r>
     </w:p>
     <w:tbl>
@@ -4564,7 +3267,6 @@
             <w:pPr>
               <w:spacing w:line="260" w:lineRule="auto"/>
             </w:pPr>
-            <w:proofErr w:type="gramStart"/>
             <w:r>
               <w:rPr>
                 <w:rFonts w:ascii="Consolas" w:eastAsia="Consolas" w:hAnsi="Consolas" w:cs="Consolas"/>
@@ -4572,9 +3274,13 @@
                 <w:sz w:val="18"/>
                 <w:szCs w:val="18"/>
               </w:rPr>
-              <w:t>#include</w:t>
-            </w:r>
-            <w:proofErr w:type="gramEnd"/>
+              <w:t xml:space="preserve">#include &lt;WiFi.h&gt;</w:t>
+            </w:r>
+          </w:p>
+          <w:p>
+            <w:pPr>
+              <w:spacing w:line="260" w:lineRule="auto"/>
+            </w:pPr>
             <w:r>
               <w:rPr>
                 <w:rFonts w:ascii="Consolas" w:eastAsia="Consolas" w:hAnsi="Consolas" w:cs="Consolas"/>
@@ -4582,9 +3288,13 @@
                 <w:sz w:val="18"/>
                 <w:szCs w:val="18"/>
               </w:rPr>
-              <w:t xml:space="preserve"> &lt;</w:t>
-            </w:r>
-            <w:proofErr w:type="spellStart"/>
+              <w:t xml:space="preserve">#include &lt;PubSubClient.h&gt;</w:t>
+            </w:r>
+          </w:p>
+          <w:p>
+            <w:pPr>
+              <w:spacing w:line="260" w:lineRule="auto"/>
+            </w:pPr>
             <w:r>
               <w:rPr>
                 <w:rFonts w:ascii="Consolas" w:eastAsia="Consolas" w:hAnsi="Consolas" w:cs="Consolas"/>
@@ -4592,9 +3302,13 @@
                 <w:sz w:val="18"/>
                 <w:szCs w:val="18"/>
               </w:rPr>
-              <w:t>WiFi.h</w:t>
-            </w:r>
-            <w:proofErr w:type="spellEnd"/>
+              <w:t xml:space="preserve"> </w:t>
+            </w:r>
+          </w:p>
+          <w:p>
+            <w:pPr>
+              <w:spacing w:line="260" w:lineRule="auto"/>
+            </w:pPr>
             <w:r>
               <w:rPr>
                 <w:rFonts w:ascii="Consolas" w:eastAsia="Consolas" w:hAnsi="Consolas" w:cs="Consolas"/>
@@ -4602,14 +3316,13 @@
                 <w:sz w:val="18"/>
                 <w:szCs w:val="18"/>
               </w:rPr>
-              <w:t>&gt;</w:t>
+              <w:t xml:space="preserve">const char* ssid = "CYBER_EXT";</w:t>
             </w:r>
           </w:p>
           <w:p>
             <w:pPr>
               <w:spacing w:line="260" w:lineRule="auto"/>
             </w:pPr>
-            <w:proofErr w:type="gramStart"/>
             <w:r>
               <w:rPr>
                 <w:rFonts w:ascii="Consolas" w:eastAsia="Consolas" w:hAnsi="Consolas" w:cs="Consolas"/>
@@ -4617,9 +3330,13 @@
                 <w:sz w:val="18"/>
                 <w:szCs w:val="18"/>
               </w:rPr>
-              <w:t>#include</w:t>
-            </w:r>
-            <w:proofErr w:type="gramEnd"/>
+              <w:t>const char* password = "cyberap2025";</w:t>
+            </w:r>
+          </w:p>
+          <w:p>
+            <w:pPr>
+              <w:spacing w:line="260" w:lineRule="auto"/>
+            </w:pPr>
             <w:r>
               <w:rPr>
                 <w:rFonts w:ascii="Consolas" w:eastAsia="Consolas" w:hAnsi="Consolas" w:cs="Consolas"/>
@@ -4627,9 +3344,13 @@
                 <w:sz w:val="18"/>
                 <w:szCs w:val="18"/>
               </w:rPr>
-              <w:t xml:space="preserve"> &lt;</w:t>
-            </w:r>
-            <w:proofErr w:type="spellStart"/>
+              <w:t xml:space="preserve"> </w:t>
+            </w:r>
+          </w:p>
+          <w:p>
+            <w:pPr>
+              <w:spacing w:line="260" w:lineRule="auto"/>
+            </w:pPr>
             <w:r>
               <w:rPr>
                 <w:rFonts w:ascii="Consolas" w:eastAsia="Consolas" w:hAnsi="Consolas" w:cs="Consolas"/>
@@ -4637,9 +3358,13 @@
                 <w:sz w:val="18"/>
                 <w:szCs w:val="18"/>
               </w:rPr>
-              <w:t>PubSubClient</w:t>
-            </w:r>
-            <w:proofErr w:type="gramStart"/>
+              <w:t xml:space="preserve">const char* mqttServer = "broker.emqx.io";</w:t>
+            </w:r>
+          </w:p>
+          <w:p>
+            <w:pPr>
+              <w:spacing w:line="260" w:lineRule="auto"/>
+            </w:pPr>
             <w:r>
               <w:rPr>
                 <w:rFonts w:ascii="Consolas" w:eastAsia="Consolas" w:hAnsi="Consolas" w:cs="Consolas"/>
@@ -4647,10 +3372,13 @@
                 <w:sz w:val="18"/>
                 <w:szCs w:val="18"/>
               </w:rPr>
-              <w:t>.h</w:t>
-            </w:r>
-            <w:proofErr w:type="spellEnd"/>
-            <w:proofErr w:type="gramEnd"/>
+              <w:t xml:space="preserve">const int mqttPort = 8884;</w:t>
+            </w:r>
+          </w:p>
+          <w:p>
+            <w:pPr>
+              <w:spacing w:line="260" w:lineRule="auto"/>
+            </w:pPr>
             <w:r>
               <w:rPr>
                 <w:rFonts w:ascii="Consolas" w:eastAsia="Consolas" w:hAnsi="Consolas" w:cs="Consolas"/>
@@ -4658,7 +3386,7 @@
                 <w:sz w:val="18"/>
                 <w:szCs w:val="18"/>
               </w:rPr>
-              <w:t>&gt;</w:t>
+              <w:t xml:space="preserve"> </w:t>
             </w:r>
           </w:p>
           <w:p>
@@ -4672,7 +3400,7 @@
                 <w:sz w:val="18"/>
                 <w:szCs w:val="18"/>
               </w:rPr>
-              <w:t xml:space="preserve"> </w:t>
+              <w:t xml:space="preserve">WiFiClient espClient;</w:t>
             </w:r>
           </w:p>
           <w:p>
@@ -4686,9 +3414,13 @@
                 <w:sz w:val="18"/>
                 <w:szCs w:val="18"/>
               </w:rPr>
-              <w:t xml:space="preserve">const char* </w:t>
-            </w:r>
-            <w:proofErr w:type="spellStart"/>
+              <w:t xml:space="preserve">PubSubClient client(espClient);</w:t>
+            </w:r>
+          </w:p>
+          <w:p>
+            <w:pPr>
+              <w:spacing w:line="260" w:lineRule="auto"/>
+            </w:pPr>
             <w:r>
               <w:rPr>
                 <w:rFonts w:ascii="Consolas" w:eastAsia="Consolas" w:hAnsi="Consolas" w:cs="Consolas"/>
@@ -4696,9 +3428,13 @@
                 <w:sz w:val="18"/>
                 <w:szCs w:val="18"/>
               </w:rPr>
-              <w:t>ssid</w:t>
-            </w:r>
-            <w:proofErr w:type="spellEnd"/>
+              <w:t xml:space="preserve"> </w:t>
+            </w:r>
+          </w:p>
+          <w:p>
+            <w:pPr>
+              <w:spacing w:line="260" w:lineRule="auto"/>
+            </w:pPr>
             <w:r>
               <w:rPr>
                 <w:rFonts w:ascii="Consolas" w:eastAsia="Consolas" w:hAnsi="Consolas" w:cs="Consolas"/>
@@ -4706,7 +3442,7 @@
                 <w:sz w:val="18"/>
                 <w:szCs w:val="18"/>
               </w:rPr>
-              <w:t xml:space="preserve"> = "CYBER_EXT";</w:t>
+              <w:t xml:space="preserve">void setup()</w:t>
             </w:r>
           </w:p>
           <w:p>
@@ -4720,7 +3456,7 @@
                 <w:sz w:val="18"/>
                 <w:szCs w:val="18"/>
               </w:rPr>
-              <w:t>const char* password = "cyberap2025";</w:t>
+              <w:t>{</w:t>
             </w:r>
           </w:p>
           <w:p>
@@ -4734,7 +3470,7 @@
                 <w:sz w:val="18"/>
                 <w:szCs w:val="18"/>
               </w:rPr>
-              <w:t xml:space="preserve"> </w:t>
+              <w:t xml:space="preserve">  Serial.begin(115200);</w:t>
             </w:r>
           </w:p>
           <w:p>
@@ -4748,9 +3484,13 @@
                 <w:sz w:val="18"/>
                 <w:szCs w:val="18"/>
               </w:rPr>
-              <w:t xml:space="preserve">const char* </w:t>
-            </w:r>
-            <w:proofErr w:type="spellStart"/>
+              <w:t xml:space="preserve">  WiFi.begin(ssid, password);</w:t>
+            </w:r>
+          </w:p>
+          <w:p>
+            <w:pPr>
+              <w:spacing w:line="260" w:lineRule="auto"/>
+            </w:pPr>
             <w:r>
               <w:rPr>
                 <w:rFonts w:ascii="Consolas" w:eastAsia="Consolas" w:hAnsi="Consolas" w:cs="Consolas"/>
@@ -4758,9 +3498,13 @@
                 <w:sz w:val="18"/>
                 <w:szCs w:val="18"/>
               </w:rPr>
-              <w:t>mqttServer</w:t>
-            </w:r>
-            <w:proofErr w:type="spellEnd"/>
+              <w:t xml:space="preserve">  while (WiFi.status() != WL_CONNECTED)</w:t>
+            </w:r>
+          </w:p>
+          <w:p>
+            <w:pPr>
+              <w:spacing w:line="260" w:lineRule="auto"/>
+            </w:pPr>
             <w:r>
               <w:rPr>
                 <w:rFonts w:ascii="Consolas" w:eastAsia="Consolas" w:hAnsi="Consolas" w:cs="Consolas"/>
@@ -4768,7 +3512,7 @@
                 <w:sz w:val="18"/>
                 <w:szCs w:val="18"/>
               </w:rPr>
-              <w:t xml:space="preserve"> = "broker.emqx.io";</w:t>
+              <w:t xml:space="preserve">  {</w:t>
             </w:r>
           </w:p>
           <w:p>
@@ -4782,9 +3526,13 @@
                 <w:sz w:val="18"/>
                 <w:szCs w:val="18"/>
               </w:rPr>
-              <w:t xml:space="preserve">const int </w:t>
-            </w:r>
-            <w:proofErr w:type="spellStart"/>
+              <w:t xml:space="preserve">    delay(500);</w:t>
+            </w:r>
+          </w:p>
+          <w:p>
+            <w:pPr>
+              <w:spacing w:line="260" w:lineRule="auto"/>
+            </w:pPr>
             <w:r>
               <w:rPr>
                 <w:rFonts w:ascii="Consolas" w:eastAsia="Consolas" w:hAnsi="Consolas" w:cs="Consolas"/>
@@ -4792,9 +3540,13 @@
                 <w:sz w:val="18"/>
                 <w:szCs w:val="18"/>
               </w:rPr>
-              <w:t>mqttPort</w:t>
-            </w:r>
-            <w:proofErr w:type="spellEnd"/>
+              <w:t xml:space="preserve">    Serial.print(".");</w:t>
+            </w:r>
+          </w:p>
+          <w:p>
+            <w:pPr>
+              <w:spacing w:line="260" w:lineRule="auto"/>
+            </w:pPr>
             <w:r>
               <w:rPr>
                 <w:rFonts w:ascii="Consolas" w:eastAsia="Consolas" w:hAnsi="Consolas" w:cs="Consolas"/>
@@ -4802,7 +3554,7 @@
                 <w:sz w:val="18"/>
                 <w:szCs w:val="18"/>
               </w:rPr>
-              <w:t xml:space="preserve"> = 8884;</w:t>
+              <w:t xml:space="preserve">  }</w:t>
             </w:r>
           </w:p>
           <w:p>
@@ -4816,14 +3568,13 @@
                 <w:sz w:val="18"/>
                 <w:szCs w:val="18"/>
               </w:rPr>
-              <w:t xml:space="preserve"> </w:t>
+              <w:t xml:space="preserve">  Serial.println("WiFi connected");</w:t>
             </w:r>
           </w:p>
           <w:p>
             <w:pPr>
               <w:spacing w:line="260" w:lineRule="auto"/>
             </w:pPr>
-            <w:proofErr w:type="spellStart"/>
             <w:r>
               <w:rPr>
                 <w:rFonts w:ascii="Consolas" w:eastAsia="Consolas" w:hAnsi="Consolas" w:cs="Consolas"/>
@@ -4831,9 +3582,13 @@
                 <w:sz w:val="18"/>
                 <w:szCs w:val="18"/>
               </w:rPr>
-              <w:t>WiFiClient</w:t>
-            </w:r>
-            <w:proofErr w:type="spellEnd"/>
+              <w:t xml:space="preserve">  client.setServer(mqttServer, mqttPort);</w:t>
+            </w:r>
+          </w:p>
+          <w:p>
+            <w:pPr>
+              <w:spacing w:line="260" w:lineRule="auto"/>
+            </w:pPr>
             <w:r>
               <w:rPr>
                 <w:rFonts w:ascii="Consolas" w:eastAsia="Consolas" w:hAnsi="Consolas" w:cs="Consolas"/>
@@ -4841,9 +3596,13 @@
                 <w:sz w:val="18"/>
                 <w:szCs w:val="18"/>
               </w:rPr>
-              <w:t xml:space="preserve"> </w:t>
-            </w:r>
-            <w:proofErr w:type="spellStart"/>
+              <w:t xml:space="preserve">  if (client.connect("ESP32_1"))</w:t>
+            </w:r>
+          </w:p>
+          <w:p>
+            <w:pPr>
+              <w:spacing w:line="260" w:lineRule="auto"/>
+            </w:pPr>
             <w:r>
               <w:rPr>
                 <w:rFonts w:ascii="Consolas" w:eastAsia="Consolas" w:hAnsi="Consolas" w:cs="Consolas"/>
@@ -4851,9 +3610,13 @@
                 <w:sz w:val="18"/>
                 <w:szCs w:val="18"/>
               </w:rPr>
-              <w:t>espClient</w:t>
-            </w:r>
-            <w:proofErr w:type="spellEnd"/>
+              <w:t xml:space="preserve">  {</w:t>
+            </w:r>
+          </w:p>
+          <w:p>
+            <w:pPr>
+              <w:spacing w:line="260" w:lineRule="auto"/>
+            </w:pPr>
             <w:r>
               <w:rPr>
                 <w:rFonts w:ascii="Consolas" w:eastAsia="Consolas" w:hAnsi="Consolas" w:cs="Consolas"/>
@@ -4861,14 +3624,13 @@
                 <w:sz w:val="18"/>
                 <w:szCs w:val="18"/>
               </w:rPr>
-              <w:t>;</w:t>
+              <w:t xml:space="preserve">    Serial.println("MQTT Connected");</w:t>
             </w:r>
           </w:p>
           <w:p>
             <w:pPr>
               <w:spacing w:line="260" w:lineRule="auto"/>
             </w:pPr>
-            <w:proofErr w:type="spellStart"/>
             <w:r>
               <w:rPr>
                 <w:rFonts w:ascii="Consolas" w:eastAsia="Consolas" w:hAnsi="Consolas" w:cs="Consolas"/>
@@ -4876,9 +3638,13 @@
                 <w:sz w:val="18"/>
                 <w:szCs w:val="18"/>
               </w:rPr>
-              <w:t>PubSubClient</w:t>
-            </w:r>
-            <w:proofErr w:type="spellEnd"/>
+              <w:t xml:space="preserve">    client.publish("esp32/test","Hello from ESP32");</w:t>
+            </w:r>
+          </w:p>
+          <w:p>
+            <w:pPr>
+              <w:spacing w:line="260" w:lineRule="auto"/>
+            </w:pPr>
             <w:r>
               <w:rPr>
                 <w:rFonts w:ascii="Consolas" w:eastAsia="Consolas" w:hAnsi="Consolas" w:cs="Consolas"/>
@@ -4886,9 +3652,13 @@
                 <w:sz w:val="18"/>
                 <w:szCs w:val="18"/>
               </w:rPr>
-              <w:t xml:space="preserve"> client(</w:t>
-            </w:r>
-            <w:proofErr w:type="spellStart"/>
+              <w:t xml:space="preserve">  }</w:t>
+            </w:r>
+          </w:p>
+          <w:p>
+            <w:pPr>
+              <w:spacing w:line="260" w:lineRule="auto"/>
+            </w:pPr>
             <w:r>
               <w:rPr>
                 <w:rFonts w:ascii="Consolas" w:eastAsia="Consolas" w:hAnsi="Consolas" w:cs="Consolas"/>
@@ -4896,9 +3666,13 @@
                 <w:sz w:val="18"/>
                 <w:szCs w:val="18"/>
               </w:rPr>
-              <w:t>espClient</w:t>
-            </w:r>
-            <w:proofErr w:type="spellEnd"/>
+              <w:t>}</w:t>
+            </w:r>
+          </w:p>
+          <w:p>
+            <w:pPr>
+              <w:spacing w:line="260" w:lineRule="auto"/>
+            </w:pPr>
             <w:r>
               <w:rPr>
                 <w:rFonts w:ascii="Consolas" w:eastAsia="Consolas" w:hAnsi="Consolas" w:cs="Consolas"/>
@@ -4906,7 +3680,7 @@
                 <w:sz w:val="18"/>
                 <w:szCs w:val="18"/>
               </w:rPr>
-              <w:t>);</w:t>
+              <w:t xml:space="preserve"> </w:t>
             </w:r>
           </w:p>
           <w:p>
@@ -4920,7 +3694,7 @@
                 <w:sz w:val="18"/>
                 <w:szCs w:val="18"/>
               </w:rPr>
-              <w:t xml:space="preserve"> </w:t>
+              <w:t xml:space="preserve">void loop()</w:t>
             </w:r>
           </w:p>
           <w:p>
@@ -4934,9 +3708,13 @@
                 <w:sz w:val="18"/>
                 <w:szCs w:val="18"/>
               </w:rPr>
-              <w:t xml:space="preserve">void </w:t>
-            </w:r>
-            <w:proofErr w:type="gramStart"/>
+              <w:t>{</w:t>
+            </w:r>
+          </w:p>
+          <w:p>
+            <w:pPr>
+              <w:spacing w:line="260" w:lineRule="auto"/>
+            </w:pPr>
             <w:r>
               <w:rPr>
                 <w:rFonts w:ascii="Consolas" w:eastAsia="Consolas" w:hAnsi="Consolas" w:cs="Consolas"/>
@@ -4944,665 +3722,7 @@
                 <w:sz w:val="18"/>
                 <w:szCs w:val="18"/>
               </w:rPr>
-              <w:t>setup(</w:t>
-            </w:r>
-            <w:proofErr w:type="gramEnd"/>
-            <w:r>
-              <w:rPr>
-                <w:rFonts w:ascii="Consolas" w:eastAsia="Consolas" w:hAnsi="Consolas" w:cs="Consolas"/>
-                <w:color w:val="1A1A1A"/>
-                <w:sz w:val="18"/>
-                <w:szCs w:val="18"/>
-              </w:rPr>
-              <w:t>)</w:t>
-            </w:r>
-          </w:p>
-          <w:p>
-            <w:pPr>
-              <w:spacing w:line="260" w:lineRule="auto"/>
-            </w:pPr>
-            <w:r>
-              <w:rPr>
-                <w:rFonts w:ascii="Consolas" w:eastAsia="Consolas" w:hAnsi="Consolas" w:cs="Consolas"/>
-                <w:color w:val="1A1A1A"/>
-                <w:sz w:val="18"/>
-                <w:szCs w:val="18"/>
-              </w:rPr>
-              <w:t>{</w:t>
-            </w:r>
-          </w:p>
-          <w:p>
-            <w:pPr>
-              <w:spacing w:line="260" w:lineRule="auto"/>
-            </w:pPr>
-            <w:r>
-              <w:rPr>
-                <w:rFonts w:ascii="Consolas" w:eastAsia="Consolas" w:hAnsi="Consolas" w:cs="Consolas"/>
-                <w:color w:val="1A1A1A"/>
-                <w:sz w:val="18"/>
-                <w:szCs w:val="18"/>
-              </w:rPr>
-              <w:t xml:space="preserve">  </w:t>
-            </w:r>
-            <w:proofErr w:type="spellStart"/>
-            <w:r>
-              <w:rPr>
-                <w:rFonts w:ascii="Consolas" w:eastAsia="Consolas" w:hAnsi="Consolas" w:cs="Consolas"/>
-                <w:color w:val="1A1A1A"/>
-                <w:sz w:val="18"/>
-                <w:szCs w:val="18"/>
-              </w:rPr>
-              <w:t>Serial.begin</w:t>
-            </w:r>
-            <w:proofErr w:type="spellEnd"/>
-            <w:r>
-              <w:rPr>
-                <w:rFonts w:ascii="Consolas" w:eastAsia="Consolas" w:hAnsi="Consolas" w:cs="Consolas"/>
-                <w:color w:val="1A1A1A"/>
-                <w:sz w:val="18"/>
-                <w:szCs w:val="18"/>
-              </w:rPr>
-              <w:t>(115200);</w:t>
-            </w:r>
-          </w:p>
-          <w:p>
-            <w:pPr>
-              <w:spacing w:line="260" w:lineRule="auto"/>
-            </w:pPr>
-            <w:r>
-              <w:rPr>
-                <w:rFonts w:ascii="Consolas" w:eastAsia="Consolas" w:hAnsi="Consolas" w:cs="Consolas"/>
-                <w:color w:val="1A1A1A"/>
-                <w:sz w:val="18"/>
-                <w:szCs w:val="18"/>
-              </w:rPr>
-              <w:t xml:space="preserve">  </w:t>
-            </w:r>
-            <w:proofErr w:type="spellStart"/>
-            <w:r>
-              <w:rPr>
-                <w:rFonts w:ascii="Consolas" w:eastAsia="Consolas" w:hAnsi="Consolas" w:cs="Consolas"/>
-                <w:color w:val="1A1A1A"/>
-                <w:sz w:val="18"/>
-                <w:szCs w:val="18"/>
-              </w:rPr>
-              <w:t>WiFi.begin</w:t>
-            </w:r>
-            <w:proofErr w:type="spellEnd"/>
-            <w:r>
-              <w:rPr>
-                <w:rFonts w:ascii="Consolas" w:eastAsia="Consolas" w:hAnsi="Consolas" w:cs="Consolas"/>
-                <w:color w:val="1A1A1A"/>
-                <w:sz w:val="18"/>
-                <w:szCs w:val="18"/>
-              </w:rPr>
-              <w:t>(</w:t>
-            </w:r>
-            <w:proofErr w:type="spellStart"/>
-            <w:r>
-              <w:rPr>
-                <w:rFonts w:ascii="Consolas" w:eastAsia="Consolas" w:hAnsi="Consolas" w:cs="Consolas"/>
-                <w:color w:val="1A1A1A"/>
-                <w:sz w:val="18"/>
-                <w:szCs w:val="18"/>
-              </w:rPr>
-              <w:t>ssid</w:t>
-            </w:r>
-            <w:proofErr w:type="spellEnd"/>
-            <w:r>
-              <w:rPr>
-                <w:rFonts w:ascii="Consolas" w:eastAsia="Consolas" w:hAnsi="Consolas" w:cs="Consolas"/>
-                <w:color w:val="1A1A1A"/>
-                <w:sz w:val="18"/>
-                <w:szCs w:val="18"/>
-              </w:rPr>
-              <w:t>, password);</w:t>
-            </w:r>
-          </w:p>
-          <w:p>
-            <w:pPr>
-              <w:spacing w:line="260" w:lineRule="auto"/>
-            </w:pPr>
-            <w:r>
-              <w:rPr>
-                <w:rFonts w:ascii="Consolas" w:eastAsia="Consolas" w:hAnsi="Consolas" w:cs="Consolas"/>
-                <w:color w:val="1A1A1A"/>
-                <w:sz w:val="18"/>
-                <w:szCs w:val="18"/>
-              </w:rPr>
-              <w:t xml:space="preserve">  while (</w:t>
-            </w:r>
-            <w:proofErr w:type="spellStart"/>
-            <w:r>
-              <w:rPr>
-                <w:rFonts w:ascii="Consolas" w:eastAsia="Consolas" w:hAnsi="Consolas" w:cs="Consolas"/>
-                <w:color w:val="1A1A1A"/>
-                <w:sz w:val="18"/>
-                <w:szCs w:val="18"/>
-              </w:rPr>
-              <w:t>WiFi.status</w:t>
-            </w:r>
-            <w:proofErr w:type="spellEnd"/>
-            <w:r>
-              <w:rPr>
-                <w:rFonts w:ascii="Consolas" w:eastAsia="Consolas" w:hAnsi="Consolas" w:cs="Consolas"/>
-                <w:color w:val="1A1A1A"/>
-                <w:sz w:val="18"/>
-                <w:szCs w:val="18"/>
-              </w:rPr>
-              <w:t>(</w:t>
-            </w:r>
-            <w:proofErr w:type="gramStart"/>
-            <w:r>
-              <w:rPr>
-                <w:rFonts w:ascii="Consolas" w:eastAsia="Consolas" w:hAnsi="Consolas" w:cs="Consolas"/>
-                <w:color w:val="1A1A1A"/>
-                <w:sz w:val="18"/>
-                <w:szCs w:val="18"/>
-              </w:rPr>
-              <w:t>) !</w:t>
-            </w:r>
-            <w:proofErr w:type="gramEnd"/>
-            <w:r>
-              <w:rPr>
-                <w:rFonts w:ascii="Consolas" w:eastAsia="Consolas" w:hAnsi="Consolas" w:cs="Consolas"/>
-                <w:color w:val="1A1A1A"/>
-                <w:sz w:val="18"/>
-                <w:szCs w:val="18"/>
-              </w:rPr>
-              <w:t>= WL_CONNECTED)</w:t>
-            </w:r>
-          </w:p>
-          <w:p>
-            <w:pPr>
-              <w:spacing w:line="260" w:lineRule="auto"/>
-            </w:pPr>
-            <w:r>
-              <w:rPr>
-                <w:rFonts w:ascii="Consolas" w:eastAsia="Consolas" w:hAnsi="Consolas" w:cs="Consolas"/>
-                <w:color w:val="1A1A1A"/>
-                <w:sz w:val="18"/>
-                <w:szCs w:val="18"/>
-              </w:rPr>
-              <w:t xml:space="preserve">  {</w:t>
-            </w:r>
-          </w:p>
-          <w:p>
-            <w:pPr>
-              <w:spacing w:line="260" w:lineRule="auto"/>
-            </w:pPr>
-            <w:r>
-              <w:rPr>
-                <w:rFonts w:ascii="Consolas" w:eastAsia="Consolas" w:hAnsi="Consolas" w:cs="Consolas"/>
-                <w:color w:val="1A1A1A"/>
-                <w:sz w:val="18"/>
-                <w:szCs w:val="18"/>
-              </w:rPr>
-              <w:t xml:space="preserve">    </w:t>
-            </w:r>
-            <w:proofErr w:type="gramStart"/>
-            <w:r>
-              <w:rPr>
-                <w:rFonts w:ascii="Consolas" w:eastAsia="Consolas" w:hAnsi="Consolas" w:cs="Consolas"/>
-                <w:color w:val="1A1A1A"/>
-                <w:sz w:val="18"/>
-                <w:szCs w:val="18"/>
-              </w:rPr>
-              <w:t>delay(</w:t>
-            </w:r>
-            <w:proofErr w:type="gramEnd"/>
-            <w:r>
-              <w:rPr>
-                <w:rFonts w:ascii="Consolas" w:eastAsia="Consolas" w:hAnsi="Consolas" w:cs="Consolas"/>
-                <w:color w:val="1A1A1A"/>
-                <w:sz w:val="18"/>
-                <w:szCs w:val="18"/>
-              </w:rPr>
-              <w:t>500);</w:t>
-            </w:r>
-          </w:p>
-          <w:p>
-            <w:pPr>
-              <w:spacing w:line="260" w:lineRule="auto"/>
-            </w:pPr>
-            <w:r>
-              <w:rPr>
-                <w:rFonts w:ascii="Consolas" w:eastAsia="Consolas" w:hAnsi="Consolas" w:cs="Consolas"/>
-                <w:color w:val="1A1A1A"/>
-                <w:sz w:val="18"/>
-                <w:szCs w:val="18"/>
-              </w:rPr>
-              <w:t xml:space="preserve">    </w:t>
-            </w:r>
-            <w:proofErr w:type="spellStart"/>
-            <w:r>
-              <w:rPr>
-                <w:rFonts w:ascii="Consolas" w:eastAsia="Consolas" w:hAnsi="Consolas" w:cs="Consolas"/>
-                <w:color w:val="1A1A1A"/>
-                <w:sz w:val="18"/>
-                <w:szCs w:val="18"/>
-              </w:rPr>
-              <w:t>Serial.print</w:t>
-            </w:r>
-            <w:proofErr w:type="spellEnd"/>
-            <w:r>
-              <w:rPr>
-                <w:rFonts w:ascii="Consolas" w:eastAsia="Consolas" w:hAnsi="Consolas" w:cs="Consolas"/>
-                <w:color w:val="1A1A1A"/>
-                <w:sz w:val="18"/>
-                <w:szCs w:val="18"/>
-              </w:rPr>
-              <w:t>(".");</w:t>
-            </w:r>
-          </w:p>
-          <w:p>
-            <w:pPr>
-              <w:spacing w:line="260" w:lineRule="auto"/>
-            </w:pPr>
-            <w:r>
-              <w:rPr>
-                <w:rFonts w:ascii="Consolas" w:eastAsia="Consolas" w:hAnsi="Consolas" w:cs="Consolas"/>
-                <w:color w:val="1A1A1A"/>
-                <w:sz w:val="18"/>
-                <w:szCs w:val="18"/>
-              </w:rPr>
-              <w:t xml:space="preserve">  }</w:t>
-            </w:r>
-          </w:p>
-          <w:p>
-            <w:pPr>
-              <w:spacing w:line="260" w:lineRule="auto"/>
-            </w:pPr>
-            <w:r>
-              <w:rPr>
-                <w:rFonts w:ascii="Consolas" w:eastAsia="Consolas" w:hAnsi="Consolas" w:cs="Consolas"/>
-                <w:color w:val="1A1A1A"/>
-                <w:sz w:val="18"/>
-                <w:szCs w:val="18"/>
-              </w:rPr>
-              <w:t xml:space="preserve">  </w:t>
-            </w:r>
-            <w:proofErr w:type="spellStart"/>
-            <w:r>
-              <w:rPr>
-                <w:rFonts w:ascii="Consolas" w:eastAsia="Consolas" w:hAnsi="Consolas" w:cs="Consolas"/>
-                <w:color w:val="1A1A1A"/>
-                <w:sz w:val="18"/>
-                <w:szCs w:val="18"/>
-              </w:rPr>
-              <w:t>Serial.println</w:t>
-            </w:r>
-            <w:proofErr w:type="spellEnd"/>
-            <w:r>
-              <w:rPr>
-                <w:rFonts w:ascii="Consolas" w:eastAsia="Consolas" w:hAnsi="Consolas" w:cs="Consolas"/>
-                <w:color w:val="1A1A1A"/>
-                <w:sz w:val="18"/>
-                <w:szCs w:val="18"/>
-              </w:rPr>
-              <w:t>("</w:t>
-            </w:r>
-            <w:proofErr w:type="spellStart"/>
-            <w:r>
-              <w:rPr>
-                <w:rFonts w:ascii="Consolas" w:eastAsia="Consolas" w:hAnsi="Consolas" w:cs="Consolas"/>
-                <w:color w:val="1A1A1A"/>
-                <w:sz w:val="18"/>
-                <w:szCs w:val="18"/>
-              </w:rPr>
-              <w:t>WiFi</w:t>
-            </w:r>
-            <w:proofErr w:type="spellEnd"/>
-            <w:r>
-              <w:rPr>
-                <w:rFonts w:ascii="Consolas" w:eastAsia="Consolas" w:hAnsi="Consolas" w:cs="Consolas"/>
-                <w:color w:val="1A1A1A"/>
-                <w:sz w:val="18"/>
-                <w:szCs w:val="18"/>
-              </w:rPr>
-              <w:t xml:space="preserve"> connected");</w:t>
-            </w:r>
-          </w:p>
-          <w:p>
-            <w:pPr>
-              <w:spacing w:line="260" w:lineRule="auto"/>
-            </w:pPr>
-            <w:r>
-              <w:rPr>
-                <w:rFonts w:ascii="Consolas" w:eastAsia="Consolas" w:hAnsi="Consolas" w:cs="Consolas"/>
-                <w:color w:val="1A1A1A"/>
-                <w:sz w:val="18"/>
-                <w:szCs w:val="18"/>
-              </w:rPr>
-              <w:t xml:space="preserve">  </w:t>
-            </w:r>
-            <w:proofErr w:type="spellStart"/>
-            <w:proofErr w:type="gramStart"/>
-            <w:r>
-              <w:rPr>
-                <w:rFonts w:ascii="Consolas" w:eastAsia="Consolas" w:hAnsi="Consolas" w:cs="Consolas"/>
-                <w:color w:val="1A1A1A"/>
-                <w:sz w:val="18"/>
-                <w:szCs w:val="18"/>
-              </w:rPr>
-              <w:t>client.setServer</w:t>
-            </w:r>
-            <w:proofErr w:type="spellEnd"/>
-            <w:proofErr w:type="gramEnd"/>
-            <w:r>
-              <w:rPr>
-                <w:rFonts w:ascii="Consolas" w:eastAsia="Consolas" w:hAnsi="Consolas" w:cs="Consolas"/>
-                <w:color w:val="1A1A1A"/>
-                <w:sz w:val="18"/>
-                <w:szCs w:val="18"/>
-              </w:rPr>
-              <w:t>(</w:t>
-            </w:r>
-            <w:proofErr w:type="spellStart"/>
-            <w:r>
-              <w:rPr>
-                <w:rFonts w:ascii="Consolas" w:eastAsia="Consolas" w:hAnsi="Consolas" w:cs="Consolas"/>
-                <w:color w:val="1A1A1A"/>
-                <w:sz w:val="18"/>
-                <w:szCs w:val="18"/>
-              </w:rPr>
-              <w:t>mqttServer</w:t>
-            </w:r>
-            <w:proofErr w:type="spellEnd"/>
-            <w:r>
-              <w:rPr>
-                <w:rFonts w:ascii="Consolas" w:eastAsia="Consolas" w:hAnsi="Consolas" w:cs="Consolas"/>
-                <w:color w:val="1A1A1A"/>
-                <w:sz w:val="18"/>
-                <w:szCs w:val="18"/>
-              </w:rPr>
-              <w:t xml:space="preserve">, </w:t>
-            </w:r>
-            <w:proofErr w:type="spellStart"/>
-            <w:r>
-              <w:rPr>
-                <w:rFonts w:ascii="Consolas" w:eastAsia="Consolas" w:hAnsi="Consolas" w:cs="Consolas"/>
-                <w:color w:val="1A1A1A"/>
-                <w:sz w:val="18"/>
-                <w:szCs w:val="18"/>
-              </w:rPr>
-              <w:t>mqttPort</w:t>
-            </w:r>
-            <w:proofErr w:type="spellEnd"/>
-            <w:r>
-              <w:rPr>
-                <w:rFonts w:ascii="Consolas" w:eastAsia="Consolas" w:hAnsi="Consolas" w:cs="Consolas"/>
-                <w:color w:val="1A1A1A"/>
-                <w:sz w:val="18"/>
-                <w:szCs w:val="18"/>
-              </w:rPr>
-              <w:t>);</w:t>
-            </w:r>
-          </w:p>
-          <w:p>
-            <w:pPr>
-              <w:spacing w:line="260" w:lineRule="auto"/>
-            </w:pPr>
-            <w:r>
-              <w:rPr>
-                <w:rFonts w:ascii="Consolas" w:eastAsia="Consolas" w:hAnsi="Consolas" w:cs="Consolas"/>
-                <w:color w:val="1A1A1A"/>
-                <w:sz w:val="18"/>
-                <w:szCs w:val="18"/>
-              </w:rPr>
-              <w:t xml:space="preserve">  if (</w:t>
-            </w:r>
-            <w:proofErr w:type="spellStart"/>
-            <w:proofErr w:type="gramStart"/>
-            <w:r>
-              <w:rPr>
-                <w:rFonts w:ascii="Consolas" w:eastAsia="Consolas" w:hAnsi="Consolas" w:cs="Consolas"/>
-                <w:color w:val="1A1A1A"/>
-                <w:sz w:val="18"/>
-                <w:szCs w:val="18"/>
-              </w:rPr>
-              <w:t>client.connect</w:t>
-            </w:r>
-            <w:proofErr w:type="spellEnd"/>
-            <w:proofErr w:type="gramEnd"/>
-            <w:r>
-              <w:rPr>
-                <w:rFonts w:ascii="Consolas" w:eastAsia="Consolas" w:hAnsi="Consolas" w:cs="Consolas"/>
-                <w:color w:val="1A1A1A"/>
-                <w:sz w:val="18"/>
-                <w:szCs w:val="18"/>
-              </w:rPr>
-              <w:t>("ESP32_1"))</w:t>
-            </w:r>
-          </w:p>
-          <w:p>
-            <w:pPr>
-              <w:spacing w:line="260" w:lineRule="auto"/>
-            </w:pPr>
-            <w:r>
-              <w:rPr>
-                <w:rFonts w:ascii="Consolas" w:eastAsia="Consolas" w:hAnsi="Consolas" w:cs="Consolas"/>
-                <w:color w:val="1A1A1A"/>
-                <w:sz w:val="18"/>
-                <w:szCs w:val="18"/>
-              </w:rPr>
-              <w:t xml:space="preserve">  {</w:t>
-            </w:r>
-          </w:p>
-          <w:p>
-            <w:pPr>
-              <w:spacing w:line="260" w:lineRule="auto"/>
-            </w:pPr>
-            <w:r>
-              <w:rPr>
-                <w:rFonts w:ascii="Consolas" w:eastAsia="Consolas" w:hAnsi="Consolas" w:cs="Consolas"/>
-                <w:color w:val="1A1A1A"/>
-                <w:sz w:val="18"/>
-                <w:szCs w:val="18"/>
-              </w:rPr>
-              <w:t xml:space="preserve">    </w:t>
-            </w:r>
-            <w:proofErr w:type="spellStart"/>
-            <w:r>
-              <w:rPr>
-                <w:rFonts w:ascii="Consolas" w:eastAsia="Consolas" w:hAnsi="Consolas" w:cs="Consolas"/>
-                <w:color w:val="1A1A1A"/>
-                <w:sz w:val="18"/>
-                <w:szCs w:val="18"/>
-              </w:rPr>
-              <w:t>Serial.println</w:t>
-            </w:r>
-            <w:proofErr w:type="spellEnd"/>
-            <w:r>
-              <w:rPr>
-                <w:rFonts w:ascii="Consolas" w:eastAsia="Consolas" w:hAnsi="Consolas" w:cs="Consolas"/>
-                <w:color w:val="1A1A1A"/>
-                <w:sz w:val="18"/>
-                <w:szCs w:val="18"/>
-              </w:rPr>
-              <w:t>("MQTT Connected");</w:t>
-            </w:r>
-          </w:p>
-          <w:p>
-            <w:pPr>
-              <w:spacing w:line="260" w:lineRule="auto"/>
-            </w:pPr>
-            <w:r>
-              <w:rPr>
-                <w:rFonts w:ascii="Consolas" w:eastAsia="Consolas" w:hAnsi="Consolas" w:cs="Consolas"/>
-                <w:color w:val="1A1A1A"/>
-                <w:sz w:val="18"/>
-                <w:szCs w:val="18"/>
-              </w:rPr>
-              <w:t xml:space="preserve">    </w:t>
-            </w:r>
-            <w:proofErr w:type="spellStart"/>
-            <w:proofErr w:type="gramStart"/>
-            <w:r>
-              <w:rPr>
-                <w:rFonts w:ascii="Consolas" w:eastAsia="Consolas" w:hAnsi="Consolas" w:cs="Consolas"/>
-                <w:color w:val="1A1A1A"/>
-                <w:sz w:val="18"/>
-                <w:szCs w:val="18"/>
-              </w:rPr>
-              <w:t>client.publish</w:t>
-            </w:r>
-            <w:proofErr w:type="spellEnd"/>
-            <w:proofErr w:type="gramEnd"/>
-            <w:r>
-              <w:rPr>
-                <w:rFonts w:ascii="Consolas" w:eastAsia="Consolas" w:hAnsi="Consolas" w:cs="Consolas"/>
-                <w:color w:val="1A1A1A"/>
-                <w:sz w:val="18"/>
-                <w:szCs w:val="18"/>
-              </w:rPr>
-              <w:t>("esp32/</w:t>
-            </w:r>
-            <w:proofErr w:type="spellStart"/>
-            <w:r>
-              <w:rPr>
-                <w:rFonts w:ascii="Consolas" w:eastAsia="Consolas" w:hAnsi="Consolas" w:cs="Consolas"/>
-                <w:color w:val="1A1A1A"/>
-                <w:sz w:val="18"/>
-                <w:szCs w:val="18"/>
-              </w:rPr>
-              <w:t>test","Hello</w:t>
-            </w:r>
-            <w:proofErr w:type="spellEnd"/>
-            <w:r>
-              <w:rPr>
-                <w:rFonts w:ascii="Consolas" w:eastAsia="Consolas" w:hAnsi="Consolas" w:cs="Consolas"/>
-                <w:color w:val="1A1A1A"/>
-                <w:sz w:val="18"/>
-                <w:szCs w:val="18"/>
-              </w:rPr>
-              <w:t xml:space="preserve"> from ESP32");</w:t>
-            </w:r>
-          </w:p>
-          <w:p>
-            <w:pPr>
-              <w:spacing w:line="260" w:lineRule="auto"/>
-            </w:pPr>
-            <w:r>
-              <w:rPr>
-                <w:rFonts w:ascii="Consolas" w:eastAsia="Consolas" w:hAnsi="Consolas" w:cs="Consolas"/>
-                <w:color w:val="1A1A1A"/>
-                <w:sz w:val="18"/>
-                <w:szCs w:val="18"/>
-              </w:rPr>
-              <w:t xml:space="preserve">  }</w:t>
-            </w:r>
-          </w:p>
-          <w:p>
-            <w:pPr>
-              <w:spacing w:line="260" w:lineRule="auto"/>
-            </w:pPr>
-            <w:r>
-              <w:rPr>
-                <w:rFonts w:ascii="Consolas" w:eastAsia="Consolas" w:hAnsi="Consolas" w:cs="Consolas"/>
-                <w:color w:val="1A1A1A"/>
-                <w:sz w:val="18"/>
-                <w:szCs w:val="18"/>
-              </w:rPr>
-              <w:t>}</w:t>
-            </w:r>
-          </w:p>
-          <w:p>
-            <w:pPr>
-              <w:spacing w:line="260" w:lineRule="auto"/>
-            </w:pPr>
-            <w:r>
-              <w:rPr>
-                <w:rFonts w:ascii="Consolas" w:eastAsia="Consolas" w:hAnsi="Consolas" w:cs="Consolas"/>
-                <w:color w:val="1A1A1A"/>
-                <w:sz w:val="18"/>
-                <w:szCs w:val="18"/>
-              </w:rPr>
-              <w:t xml:space="preserve"> </w:t>
-            </w:r>
-          </w:p>
-          <w:p>
-            <w:pPr>
-              <w:spacing w:line="260" w:lineRule="auto"/>
-            </w:pPr>
-            <w:r>
-              <w:rPr>
-                <w:rFonts w:ascii="Consolas" w:eastAsia="Consolas" w:hAnsi="Consolas" w:cs="Consolas"/>
-                <w:color w:val="1A1A1A"/>
-                <w:sz w:val="18"/>
-                <w:szCs w:val="18"/>
-              </w:rPr>
-              <w:t xml:space="preserve">void </w:t>
-            </w:r>
-            <w:proofErr w:type="gramStart"/>
-            <w:r>
-              <w:rPr>
-                <w:rFonts w:ascii="Consolas" w:eastAsia="Consolas" w:hAnsi="Consolas" w:cs="Consolas"/>
-                <w:color w:val="1A1A1A"/>
-                <w:sz w:val="18"/>
-                <w:szCs w:val="18"/>
-              </w:rPr>
-              <w:t>loop(</w:t>
-            </w:r>
-            <w:proofErr w:type="gramEnd"/>
-            <w:r>
-              <w:rPr>
-                <w:rFonts w:ascii="Consolas" w:eastAsia="Consolas" w:hAnsi="Consolas" w:cs="Consolas"/>
-                <w:color w:val="1A1A1A"/>
-                <w:sz w:val="18"/>
-                <w:szCs w:val="18"/>
-              </w:rPr>
-              <w:t>)</w:t>
-            </w:r>
-          </w:p>
-          <w:p>
-            <w:pPr>
-              <w:spacing w:line="260" w:lineRule="auto"/>
-            </w:pPr>
-            <w:r>
-              <w:rPr>
-                <w:rFonts w:ascii="Consolas" w:eastAsia="Consolas" w:hAnsi="Consolas" w:cs="Consolas"/>
-                <w:color w:val="1A1A1A"/>
-                <w:sz w:val="18"/>
-                <w:szCs w:val="18"/>
-              </w:rPr>
-              <w:t>{</w:t>
-            </w:r>
-          </w:p>
-          <w:p>
-            <w:pPr>
-              <w:spacing w:line="260" w:lineRule="auto"/>
-            </w:pPr>
-            <w:r>
-              <w:rPr>
-                <w:rFonts w:ascii="Consolas" w:eastAsia="Consolas" w:hAnsi="Consolas" w:cs="Consolas"/>
-                <w:color w:val="1A1A1A"/>
-                <w:sz w:val="18"/>
-                <w:szCs w:val="18"/>
-              </w:rPr>
-              <w:t xml:space="preserve">  </w:t>
-            </w:r>
-            <w:proofErr w:type="spellStart"/>
-            <w:proofErr w:type="gramStart"/>
-            <w:r>
-              <w:rPr>
-                <w:rFonts w:ascii="Consolas" w:eastAsia="Consolas" w:hAnsi="Consolas" w:cs="Consolas"/>
-                <w:color w:val="1A1A1A"/>
-                <w:sz w:val="18"/>
-                <w:szCs w:val="18"/>
-              </w:rPr>
-              <w:t>client.loop</w:t>
-            </w:r>
-            <w:proofErr w:type="spellEnd"/>
-            <w:proofErr w:type="gramEnd"/>
-            <w:r>
-              <w:rPr>
-                <w:rFonts w:ascii="Consolas" w:eastAsia="Consolas" w:hAnsi="Consolas" w:cs="Consolas"/>
-                <w:color w:val="1A1A1A"/>
-                <w:sz w:val="18"/>
-                <w:szCs w:val="18"/>
-              </w:rPr>
-              <w:t>();</w:t>
+              <w:t xml:space="preserve">  client.loop();</w:t>
             </w:r>
           </w:p>
           <w:p>
@@ -5650,63 +3770,7 @@
         <w:rPr>
           <w:color w:val="222222"/>
         </w:rPr>
-        <w:t xml:space="preserve">Library includes — </w:t>
-      </w:r>
-      <w:proofErr w:type="spellStart"/>
-      <w:r>
-        <w:rPr>
-          <w:color w:val="222222"/>
-        </w:rPr>
-        <w:t>WiFi.h</w:t>
-      </w:r>
-      <w:proofErr w:type="spellEnd"/>
-      <w:r>
-        <w:rPr>
-          <w:color w:val="222222"/>
-        </w:rPr>
-        <w:t xml:space="preserve"> provides the station-mode Wi-Fi connection used to reach the internet; </w:t>
-      </w:r>
-      <w:proofErr w:type="spellStart"/>
-      <w:r>
-        <w:rPr>
-          <w:color w:val="222222"/>
-        </w:rPr>
-        <w:t>PubSubClient.h</w:t>
-      </w:r>
-      <w:proofErr w:type="spellEnd"/>
-      <w:r>
-        <w:rPr>
-          <w:color w:val="222222"/>
-        </w:rPr>
-        <w:t xml:space="preserve"> provides the MQTT client itself (connect, publish, subscribe, loop). Neither library knows about the other: </w:t>
-      </w:r>
-      <w:proofErr w:type="spellStart"/>
-      <w:r>
-        <w:rPr>
-          <w:color w:val="222222"/>
-        </w:rPr>
-        <w:t>PubSubClient</w:t>
-      </w:r>
-      <w:proofErr w:type="spellEnd"/>
-      <w:r>
-        <w:rPr>
-          <w:color w:val="222222"/>
-        </w:rPr>
-        <w:t xml:space="preserve"> is built on top of whatever network </w:t>
-      </w:r>
-      <w:proofErr w:type="gramStart"/>
-      <w:r>
-        <w:rPr>
-          <w:color w:val="222222"/>
-        </w:rPr>
-        <w:t>client it</w:t>
-      </w:r>
-      <w:proofErr w:type="gramEnd"/>
-      <w:r>
-        <w:rPr>
-          <w:color w:val="222222"/>
-        </w:rPr>
-        <w:t xml:space="preserve"> is given, which is exactly what the next two lines set up.</w:t>
+        <w:t xml:space="preserve">Library includes — WiFi.h provides the station-mode Wi-Fi connection used to reach the internet; PubSubClient.h provides the MQTT client itself (connect, publish, subscribe, loop). Neither library knows about the other: PubSubClient is built on top of whatever network client it is given, which is exactly what the next two lines set up.</w:t>
       </w:r>
     </w:p>
     <w:p>
@@ -5723,35 +3787,7 @@
           <w:color w:val="222222"/>
         </w:rPr>
         <w:lastRenderedPageBreak/>
-        <w:t xml:space="preserve">Wi-Fi credentials — the network name and password are stored as plain constants at the top of the </w:t>
-      </w:r>
-      <w:proofErr w:type="gramStart"/>
-      <w:r>
-        <w:rPr>
-          <w:color w:val="222222"/>
-        </w:rPr>
-        <w:t>file</w:t>
-      </w:r>
-      <w:proofErr w:type="gramEnd"/>
-      <w:r>
-        <w:rPr>
-          <w:color w:val="222222"/>
-        </w:rPr>
-        <w:t xml:space="preserve"> so the connection details are visible and easy to change in one place, the same central-settings habit carried into </w:t>
-      </w:r>
-      <w:proofErr w:type="spellStart"/>
-      <w:r>
-        <w:rPr>
-          <w:color w:val="222222"/>
-        </w:rPr>
-        <w:t>config.h</w:t>
-      </w:r>
-      <w:proofErr w:type="spellEnd"/>
-      <w:r>
-        <w:rPr>
-          <w:color w:val="222222"/>
-        </w:rPr>
-        <w:t xml:space="preserve"> in the full project.</w:t>
+        <w:t xml:space="preserve">Wi-Fi credentials — the network name and password are stored as plain constants at the top of the file so the connection details are visible and easy to change in one place, the same central-settings habit carried into config.h in the full project.</w:t>
       </w:r>
     </w:p>
     <w:p>
@@ -5779,33 +3815,11 @@
         </w:numPr>
         <w:spacing w:after="90"/>
       </w:pPr>
-      <w:proofErr w:type="spellStart"/>
-      <w:r>
-        <w:rPr>
-          <w:color w:val="222222"/>
-        </w:rPr>
-        <w:t>WiFiClient</w:t>
-      </w:r>
-      <w:proofErr w:type="spellEnd"/>
-      <w:r>
-        <w:rPr>
-          <w:color w:val="222222"/>
-        </w:rPr>
-        <w:t xml:space="preserve"> </w:t>
-      </w:r>
-      <w:proofErr w:type="spellStart"/>
-      <w:r>
-        <w:rPr>
-          <w:color w:val="222222"/>
-        </w:rPr>
-        <w:t>espClient</w:t>
-      </w:r>
-      <w:proofErr w:type="spellEnd"/>
-      <w:r>
-        <w:rPr>
-          <w:color w:val="222222"/>
-        </w:rPr>
-        <w:t xml:space="preserve"> — this object is the actual TCP network connection. On its own it has no idea what MQTT is; it only knows how to open a socket and move raw bytes.</w:t>
+      <w:r>
+        <w:rPr>
+          <w:color w:val="222222"/>
+        </w:rPr>
+        <w:t xml:space="preserve">WiFiClient espClient — this object is the actual TCP network connection. On its own it has no idea what MQTT is; it only knows how to open a socket and move raw bytes.</w:t>
       </w:r>
     </w:p>
     <w:p>
@@ -5817,97 +3831,11 @@
         </w:numPr>
         <w:spacing w:after="90"/>
       </w:pPr>
-      <w:proofErr w:type="spellStart"/>
-      <w:r>
-        <w:rPr>
-          <w:color w:val="222222"/>
-        </w:rPr>
-        <w:t>PubSubClient</w:t>
-      </w:r>
-      <w:proofErr w:type="spellEnd"/>
-      <w:r>
-        <w:rPr>
-          <w:color w:val="222222"/>
-        </w:rPr>
-        <w:t xml:space="preserve"> client(</w:t>
-      </w:r>
-      <w:proofErr w:type="spellStart"/>
-      <w:proofErr w:type="gramStart"/>
-      <w:r>
-        <w:rPr>
-          <w:color w:val="222222"/>
-        </w:rPr>
-        <w:t>espClient</w:t>
-      </w:r>
-      <w:proofErr w:type="spellEnd"/>
-      <w:r>
-        <w:rPr>
-          <w:color w:val="222222"/>
-        </w:rPr>
-        <w:t>) —</w:t>
-      </w:r>
-      <w:proofErr w:type="gramEnd"/>
-      <w:r>
-        <w:rPr>
-          <w:color w:val="222222"/>
-        </w:rPr>
-        <w:t xml:space="preserve"> the MQTT client is constructed on top of that network connection. This single line is the entire relationship between the network layer and the MQTT layer: </w:t>
-      </w:r>
-      <w:proofErr w:type="spellStart"/>
-      <w:r>
-        <w:rPr>
-          <w:color w:val="222222"/>
-        </w:rPr>
-        <w:t>PubSubClient</w:t>
-      </w:r>
-      <w:proofErr w:type="spellEnd"/>
-      <w:r>
-        <w:rPr>
-          <w:color w:val="222222"/>
-        </w:rPr>
-        <w:t xml:space="preserve"> uses </w:t>
-      </w:r>
-      <w:proofErr w:type="spellStart"/>
-      <w:r>
-        <w:rPr>
-          <w:color w:val="222222"/>
-        </w:rPr>
-        <w:t>espClient</w:t>
-      </w:r>
-      <w:proofErr w:type="spellEnd"/>
-      <w:r>
-        <w:rPr>
-          <w:color w:val="222222"/>
-        </w:rPr>
-        <w:t xml:space="preserve"> to </w:t>
-      </w:r>
-      <w:proofErr w:type="gramStart"/>
-      <w:r>
-        <w:rPr>
-          <w:color w:val="222222"/>
-        </w:rPr>
-        <w:t>actually send</w:t>
-      </w:r>
-      <w:proofErr w:type="gramEnd"/>
-      <w:r>
-        <w:rPr>
-          <w:color w:val="222222"/>
-        </w:rPr>
-        <w:t xml:space="preserve"> and receive </w:t>
-      </w:r>
-      <w:proofErr w:type="gramStart"/>
-      <w:r>
-        <w:rPr>
-          <w:color w:val="222222"/>
-        </w:rPr>
-        <w:t>bytes, and</w:t>
-      </w:r>
-      <w:proofErr w:type="gramEnd"/>
-      <w:r>
-        <w:rPr>
-          <w:color w:val="222222"/>
-        </w:rPr>
-        <w:t xml:space="preserve"> adds the MQTT protocol logic on top.</w:t>
+      <w:r>
+        <w:rPr>
+          <w:color w:val="222222"/>
+        </w:rPr>
+        <w:t xml:space="preserve">PubSubClient client(espClient) — the MQTT client is constructed on top of that network connection. This single line is the entire relationship between the network layer and the MQTT layer: PubSubClient uses espClient to actually send and receive bytes, and adds the MQTT protocol logic on top.</w:t>
       </w:r>
     </w:p>
     <w:p>
@@ -5919,33 +3847,11 @@
         </w:numPr>
         <w:spacing w:after="90"/>
       </w:pPr>
-      <w:proofErr w:type="spellStart"/>
-      <w:r>
-        <w:rPr>
-          <w:color w:val="222222"/>
-        </w:rPr>
-        <w:t>Serial.begin</w:t>
-      </w:r>
-      <w:proofErr w:type="spellEnd"/>
-      <w:r>
-        <w:rPr>
-          <w:color w:val="222222"/>
-        </w:rPr>
-        <w:t>(</w:t>
-      </w:r>
-      <w:proofErr w:type="gramStart"/>
-      <w:r>
-        <w:rPr>
-          <w:color w:val="222222"/>
-        </w:rPr>
-        <w:t>115200) —</w:t>
-      </w:r>
-      <w:proofErr w:type="gramEnd"/>
-      <w:r>
-        <w:rPr>
-          <w:color w:val="222222"/>
-        </w:rPr>
-        <w:t xml:space="preserve"> opens the serial monitor link used purely for debugging output; it has no effect on Wi-Fi or MQTT behavior.</w:t>
+      <w:r>
+        <w:rPr>
+          <w:color w:val="222222"/>
+        </w:rPr>
+        <w:t xml:space="preserve">Serial.begin(115200) — opens the serial monitor link used purely for debugging output; it has no effect on Wi-Fi or MQTT behavior.</w:t>
       </w:r>
     </w:p>
     <w:p>
@@ -5957,61 +3863,11 @@
         </w:numPr>
         <w:spacing w:after="90"/>
       </w:pPr>
-      <w:proofErr w:type="spellStart"/>
-      <w:r>
-        <w:rPr>
-          <w:color w:val="222222"/>
-        </w:rPr>
-        <w:t>WiFi.begin</w:t>
-      </w:r>
-      <w:proofErr w:type="spellEnd"/>
-      <w:r>
-        <w:rPr>
-          <w:color w:val="222222"/>
-        </w:rPr>
-        <w:t>(</w:t>
-      </w:r>
-      <w:proofErr w:type="spellStart"/>
-      <w:r>
-        <w:rPr>
-          <w:color w:val="222222"/>
-        </w:rPr>
-        <w:t>ssid</w:t>
-      </w:r>
-      <w:proofErr w:type="spellEnd"/>
-      <w:r>
-        <w:rPr>
-          <w:color w:val="222222"/>
-        </w:rPr>
-        <w:t xml:space="preserve">, password) plus the while loop — starts the Wi-Fi connection attempt and then blocks, printing a dot roughly twice a second, until </w:t>
-      </w:r>
-      <w:proofErr w:type="spellStart"/>
-      <w:r>
-        <w:rPr>
-          <w:color w:val="222222"/>
-        </w:rPr>
-        <w:t>WiFi.status</w:t>
-      </w:r>
-      <w:proofErr w:type="spellEnd"/>
-      <w:r>
-        <w:rPr>
-          <w:color w:val="222222"/>
-        </w:rPr>
-        <w:t xml:space="preserve">() reports WL_CONNECTED. This is a blocking wait: if the credentials are wrong or the network is unreachable, the board will sit in this loop indefinitely rather than </w:t>
-      </w:r>
-      <w:proofErr w:type="gramStart"/>
-      <w:r>
-        <w:rPr>
-          <w:color w:val="222222"/>
-        </w:rPr>
-        <w:t>continuing on</w:t>
-      </w:r>
-      <w:proofErr w:type="gramEnd"/>
-      <w:r>
-        <w:rPr>
-          <w:color w:val="222222"/>
-        </w:rPr>
-        <w:t>.</w:t>
+      <w:r>
+        <w:rPr>
+          <w:color w:val="222222"/>
+        </w:rPr>
+        <w:t xml:space="preserve">WiFi.begin(ssid, password) plus the while loop — starts the Wi-Fi connection attempt and then blocks, printing a dot roughly twice a second, until WiFi.status() reports WL_CONNECTED. This is a blocking wait: if the credentials are wrong or the network is unreachable, the board will sit in this loop indefinitely rather than continuing on.</w:t>
       </w:r>
     </w:p>
     <w:p>
@@ -6023,71 +3879,11 @@
         </w:numPr>
         <w:spacing w:after="90"/>
       </w:pPr>
-      <w:proofErr w:type="spellStart"/>
-      <w:proofErr w:type="gramStart"/>
-      <w:r>
-        <w:rPr>
-          <w:color w:val="222222"/>
-        </w:rPr>
-        <w:t>client.setServer</w:t>
-      </w:r>
-      <w:proofErr w:type="spellEnd"/>
-      <w:proofErr w:type="gramEnd"/>
-      <w:r>
-        <w:rPr>
-          <w:color w:val="222222"/>
-        </w:rPr>
-        <w:t>(</w:t>
-      </w:r>
-      <w:proofErr w:type="spellStart"/>
-      <w:r>
-        <w:rPr>
-          <w:color w:val="222222"/>
-        </w:rPr>
-        <w:t>mqttServer</w:t>
-      </w:r>
-      <w:proofErr w:type="spellEnd"/>
-      <w:r>
-        <w:rPr>
-          <w:color w:val="222222"/>
-        </w:rPr>
-        <w:t xml:space="preserve">, </w:t>
-      </w:r>
-      <w:proofErr w:type="spellStart"/>
-      <w:proofErr w:type="gramStart"/>
-      <w:r>
-        <w:rPr>
-          <w:color w:val="222222"/>
-        </w:rPr>
-        <w:t>mqttPort</w:t>
-      </w:r>
-      <w:proofErr w:type="spellEnd"/>
-      <w:r>
-        <w:rPr>
-          <w:color w:val="222222"/>
-        </w:rPr>
-        <w:t>) —</w:t>
-      </w:r>
-      <w:proofErr w:type="gramEnd"/>
-      <w:r>
-        <w:rPr>
-          <w:color w:val="222222"/>
-        </w:rPr>
-        <w:t xml:space="preserve"> this only records the broker address and port inside the </w:t>
-      </w:r>
-      <w:proofErr w:type="spellStart"/>
-      <w:r>
-        <w:rPr>
-          <w:color w:val="222222"/>
-        </w:rPr>
-        <w:t>PubSubClient</w:t>
-      </w:r>
-      <w:proofErr w:type="spellEnd"/>
-      <w:r>
-        <w:rPr>
-          <w:color w:val="222222"/>
-        </w:rPr>
-        <w:t xml:space="preserve"> object; it does not open a connection by itself, in the same way that saving a phone number is not the same as making the call.</w:t>
+      <w:r>
+        <w:rPr>
+          <w:color w:val="222222"/>
+        </w:rPr>
+        <w:t xml:space="preserve">client.setServer(mqttServer, mqttPort) — this only records the broker address and port inside the PubSubClient object; it does not open a connection by itself, in the same way that saving a phone number is not the same as making the call.</w:t>
       </w:r>
     </w:p>
     <w:p>
@@ -6099,49 +3895,11 @@
         </w:numPr>
         <w:spacing w:after="90"/>
       </w:pPr>
-      <w:proofErr w:type="spellStart"/>
-      <w:proofErr w:type="gramStart"/>
-      <w:r>
-        <w:rPr>
-          <w:color w:val="222222"/>
-        </w:rPr>
-        <w:t>client.connect</w:t>
-      </w:r>
-      <w:proofErr w:type="spellEnd"/>
-      <w:proofErr w:type="gramEnd"/>
-      <w:r>
-        <w:rPr>
-          <w:color w:val="222222"/>
-        </w:rPr>
-        <w:t>("ESP32_1</w:t>
-      </w:r>
-      <w:proofErr w:type="gramStart"/>
-      <w:r>
-        <w:rPr>
-          <w:color w:val="222222"/>
-        </w:rPr>
-        <w:t>") —</w:t>
-      </w:r>
-      <w:proofErr w:type="gramEnd"/>
-      <w:r>
-        <w:rPr>
-          <w:color w:val="222222"/>
-        </w:rPr>
-        <w:t xml:space="preserve"> this is the line that </w:t>
-      </w:r>
-      <w:proofErr w:type="gramStart"/>
-      <w:r>
-        <w:rPr>
-          <w:color w:val="222222"/>
-        </w:rPr>
-        <w:t>actually performs</w:t>
-      </w:r>
-      <w:proofErr w:type="gramEnd"/>
-      <w:r>
-        <w:rPr>
-          <w:color w:val="222222"/>
-        </w:rPr>
-        <w:t xml:space="preserve"> the MQTT handshake with the broker. The string "ESP32_1" is the MQTT client identifier the broker will use to recognize this connection; the call returns true only if the broker accepted the connection.</w:t>
+      <w:r>
+        <w:rPr>
+          <w:color w:val="222222"/>
+        </w:rPr>
+        <w:t xml:space="preserve">client.connect("ESP32_1") — this is the line that actually performs the MQTT handshake with the broker. The string "ESP32_1" is the MQTT client identifier the broker will use to recognize this connection; the call returns true only if the broker accepted the connection.</w:t>
       </w:r>
     </w:p>
     <w:p>
@@ -6153,51 +3911,11 @@
         </w:numPr>
         <w:spacing w:after="90"/>
       </w:pPr>
-      <w:proofErr w:type="spellStart"/>
-      <w:proofErr w:type="gramStart"/>
-      <w:r>
-        <w:rPr>
-          <w:color w:val="222222"/>
-        </w:rPr>
-        <w:t>client.publish</w:t>
-      </w:r>
-      <w:proofErr w:type="spellEnd"/>
-      <w:proofErr w:type="gramEnd"/>
-      <w:r>
-        <w:rPr>
-          <w:color w:val="222222"/>
-        </w:rPr>
-        <w:t>("esp32/</w:t>
-      </w:r>
-      <w:proofErr w:type="spellStart"/>
-      <w:r>
-        <w:rPr>
-          <w:color w:val="222222"/>
-        </w:rPr>
-        <w:t>test","Hello</w:t>
-      </w:r>
-      <w:proofErr w:type="spellEnd"/>
-      <w:r>
-        <w:rPr>
-          <w:color w:val="222222"/>
-        </w:rPr>
-        <w:t xml:space="preserve"> from ESP32") — runs only inside the if(</w:t>
-      </w:r>
-      <w:proofErr w:type="spellStart"/>
-      <w:proofErr w:type="gramStart"/>
-      <w:r>
-        <w:rPr>
-          <w:color w:val="222222"/>
-        </w:rPr>
-        <w:t>client.connect</w:t>
-      </w:r>
-      <w:proofErr w:type="spellEnd"/>
-      <w:proofErr w:type="gramEnd"/>
-      <w:r>
-        <w:rPr>
-          <w:color w:val="222222"/>
-        </w:rPr>
-        <w:t>(...)) block, so the publish is only attempted after a successful connection; it sends one message, once, to the topic esp32/test with the payload "Hello from ESP32" — this is exactly the message captured in the screenshot above.</w:t>
+      <w:r>
+        <w:rPr>
+          <w:color w:val="222222"/>
+        </w:rPr>
+        <w:t xml:space="preserve">client.publish("esp32/test","Hello from ESP32") — runs only inside the if(client.connect(...)) block, so the publish is only attempted after a successful connection; it sends one message, once, to the topic esp32/test with the payload "Hello from ESP32" — this is exactly the message captured in the screenshot above.</w:t>
       </w:r>
     </w:p>
     <w:p>
@@ -6213,135 +3931,7 @@
         <w:rPr>
           <w:color w:val="222222"/>
         </w:rPr>
-        <w:t xml:space="preserve">void </w:t>
-      </w:r>
-      <w:proofErr w:type="gramStart"/>
-      <w:r>
-        <w:rPr>
-          <w:color w:val="222222"/>
-        </w:rPr>
-        <w:t>loop(</w:t>
-      </w:r>
-      <w:proofErr w:type="gramEnd"/>
-      <w:r>
-        <w:rPr>
-          <w:color w:val="222222"/>
-        </w:rPr>
-        <w:t xml:space="preserve">) </w:t>
-      </w:r>
-      <w:proofErr w:type="gramStart"/>
-      <w:r>
-        <w:rPr>
-          <w:color w:val="222222"/>
-        </w:rPr>
-        <w:t xml:space="preserve">{ </w:t>
-      </w:r>
-      <w:proofErr w:type="spellStart"/>
-      <w:r>
-        <w:rPr>
-          <w:color w:val="222222"/>
-        </w:rPr>
-        <w:t>client</w:t>
-      </w:r>
-      <w:proofErr w:type="gramEnd"/>
-      <w:r>
-        <w:rPr>
-          <w:color w:val="222222"/>
-        </w:rPr>
-        <w:t>.</w:t>
-      </w:r>
-      <w:proofErr w:type="gramStart"/>
-      <w:r>
-        <w:rPr>
-          <w:color w:val="222222"/>
-        </w:rPr>
-        <w:t>loop</w:t>
-      </w:r>
-      <w:proofErr w:type="spellEnd"/>
-      <w:r>
-        <w:rPr>
-          <w:color w:val="222222"/>
-        </w:rPr>
-        <w:t>(</w:t>
-      </w:r>
-      <w:proofErr w:type="gramEnd"/>
-      <w:r>
-        <w:rPr>
-          <w:color w:val="222222"/>
-        </w:rPr>
-        <w:t>)</w:t>
-      </w:r>
-      <w:proofErr w:type="gramStart"/>
-      <w:r>
-        <w:rPr>
-          <w:color w:val="222222"/>
-        </w:rPr>
-        <w:t>; }</w:t>
-      </w:r>
-      <w:proofErr w:type="gramEnd"/>
-      <w:r>
-        <w:rPr>
-          <w:color w:val="222222"/>
-        </w:rPr>
-        <w:t xml:space="preserve"> — after </w:t>
-      </w:r>
-      <w:proofErr w:type="gramStart"/>
-      <w:r>
-        <w:rPr>
-          <w:color w:val="222222"/>
-        </w:rPr>
-        <w:t>setup(</w:t>
-      </w:r>
-      <w:proofErr w:type="gramEnd"/>
-      <w:r>
-        <w:rPr>
-          <w:color w:val="222222"/>
-        </w:rPr>
-        <w:t xml:space="preserve">) finishes, the board does not attempt to reconnect or publish again on its own; </w:t>
-      </w:r>
-      <w:proofErr w:type="gramStart"/>
-      <w:r>
-        <w:rPr>
-          <w:color w:val="222222"/>
-        </w:rPr>
-        <w:t>loop(</w:t>
-      </w:r>
-      <w:proofErr w:type="gramEnd"/>
-      <w:r>
-        <w:rPr>
-          <w:color w:val="222222"/>
-        </w:rPr>
-        <w:t xml:space="preserve">) only keeps calling </w:t>
-      </w:r>
-      <w:proofErr w:type="spellStart"/>
-      <w:proofErr w:type="gramStart"/>
-      <w:r>
-        <w:rPr>
-          <w:color w:val="222222"/>
-        </w:rPr>
-        <w:t>client.loop</w:t>
-      </w:r>
-      <w:proofErr w:type="spellEnd"/>
-      <w:proofErr w:type="gramEnd"/>
-      <w:r>
-        <w:rPr>
-          <w:color w:val="222222"/>
-        </w:rPr>
-        <w:t xml:space="preserve">(), which is required to service the underlying MQTT connection (keep-alive pings, incoming packet processing) but performs no new application-level action. This design is intentionally a one-shot </w:t>
-      </w:r>
-      <w:proofErr w:type="gramStart"/>
-      <w:r>
-        <w:rPr>
-          <w:color w:val="222222"/>
-        </w:rPr>
-        <w:t>publish</w:t>
-      </w:r>
-      <w:proofErr w:type="gramEnd"/>
-      <w:r>
-        <w:rPr>
-          <w:color w:val="222222"/>
-        </w:rPr>
-        <w:t xml:space="preserve"> test rather than a continuously repeating sensor publisher.</w:t>
+        <w:t xml:space="preserve">void loop() { client.loop(); } — after setup() finishes, the board does not attempt to reconnect or publish again on its own; loop() only keeps calling client.loop(), which is required to service the underlying MQTT connection (keep-alive pings, incoming packet processing) but performs no new application-level action. This design is intentionally a one-shot publish test rather than a continuously repeating sensor publisher.</w:t>
       </w:r>
     </w:p>
     <w:tbl>
@@ -6402,27 +3992,7 @@
                 <w:sz w:val="20"/>
                 <w:szCs w:val="20"/>
               </w:rPr>
-              <w:t xml:space="preserve">This sketch has no error message if </w:t>
-            </w:r>
-            <w:proofErr w:type="spellStart"/>
-            <w:proofErr w:type="gramStart"/>
-            <w:r>
-              <w:rPr>
-                <w:color w:val="333333"/>
-                <w:sz w:val="20"/>
-                <w:szCs w:val="20"/>
-              </w:rPr>
-              <w:t>client.connect</w:t>
-            </w:r>
-            <w:proofErr w:type="spellEnd"/>
-            <w:proofErr w:type="gramEnd"/>
-            <w:r>
-              <w:rPr>
-                <w:color w:val="333333"/>
-                <w:sz w:val="20"/>
-                <w:szCs w:val="20"/>
-              </w:rPr>
-              <w:t>() fails (the else branch is simply absent, so a failed MQTT connection fails silently after a successful Wi-Fi connection), no reconnect logic if the broker connection later drops, and no subscribe or callback at all, since this test only exercises the publish path. All three gaps were addressed in the full two-board project described in Sections 4–6: a dedicated MQTT class reports connection failures explicitly, the main loop can detect a dropped MQTT connection, and both boards register a callback to receive messages, not just send them.</w:t>
+              <w:t xml:space="preserve">This sketch has no error message if client.connect() fails (the else branch is simply absent, so a failed MQTT connection fails silently after a successful Wi-Fi connection), no reconnect logic if the broker connection later drops, and no subscribe or callback at all, since this test only exercises the publish path. All three gaps were addressed in the full two-board project described in Sections 4–6: a dedicated MQTT class reports connection failures explicitly, the main loop can detect a dropped MQTT connection, and both boards register a callback to receive messages, not just send them.</w:t>
             </w:r>
           </w:p>
         </w:tc>
@@ -6472,25 +4042,7 @@
                 <w:sz w:val="20"/>
                 <w:szCs w:val="20"/>
               </w:rPr>
-              <w:t xml:space="preserve">Rehearsing publish and subscribe manually, before any firmware exists, isolates protocol understanding from coding and debugging. Any confusion about "why didn't my message arrive" can be resolved at the level of broker, topic, and connection settings first, rather than </w:t>
-            </w:r>
-            <w:proofErr w:type="gramStart"/>
-            <w:r>
-              <w:rPr>
-                <w:color w:val="333333"/>
-                <w:sz w:val="20"/>
-                <w:szCs w:val="20"/>
-              </w:rPr>
-              <w:t>mixed together</w:t>
-            </w:r>
-            <w:proofErr w:type="gramEnd"/>
-            <w:r>
-              <w:rPr>
-                <w:color w:val="333333"/>
-                <w:sz w:val="20"/>
-                <w:szCs w:val="20"/>
-              </w:rPr>
-              <w:t xml:space="preserve"> with C++ logic later.</w:t>
+              <w:t xml:space="preserve">Rehearsing publish and subscribe manually, before any firmware exists, isolates protocol understanding from coding and debugging. Any confusion about "why didn't my message arrive" can be resolved at the level of broker, topic, and connection settings first, rather than mixed together with C++ logic later.</w:t>
             </w:r>
           </w:p>
           <w:p>
@@ -6554,21 +4106,7 @@
         <w:rPr>
           <w:color w:val="222222"/>
         </w:rPr>
-        <w:t xml:space="preserve">Reproduce the ESP-NOW pairing </w:t>
-      </w:r>
-      <w:proofErr w:type="gramStart"/>
-      <w:r>
-        <w:rPr>
-          <w:color w:val="222222"/>
-        </w:rPr>
-        <w:t>exercise, but</w:t>
-      </w:r>
-      <w:proofErr w:type="gramEnd"/>
-      <w:r>
-        <w:rPr>
-          <w:color w:val="222222"/>
-        </w:rPr>
-        <w:t xml:space="preserve"> replace the direct ESP-NOW link between the two boards with MQTT publish/subscribe messaging over a public broker. The sensor board and the motor board belong to two different students and must never address each other directly — all coordination happens exclusively through MQTT topics on the broker.</w:t>
+        <w:t xml:space="preserve">Reproduce the ESP-NOW pairing exercise, but replace the direct ESP-NOW link between the two boards with MQTT publish/subscribe messaging over a public broker. The two boards belong to two different students, are built with identical hardware — each with its own IR obstacle sensor and its own L298N-driven DC motor — and must never address each other directly — all coordination happens exclusively through MQTT topics on the broker.</w:t>
       </w:r>
     </w:p>
     <w:p>
@@ -6597,7 +4135,7 @@
         <w:rPr>
           <w:color w:val="222222"/>
         </w:rPr>
-        <w:t>Rather than giving one board a pure publisher role and the other a pure subscriber role, this pairing gives both boards the same capability: each board can publish its own state and subscribe to its partner's state. This is achieved with two separate topic names — one topic carries messages in each direction. Every board runs the exact same MQTT class and the exact same overall firmware structure; only the two topic names configured in that board's settings file decide which topic it publishes to and which topic it subscribes to. Swapping those two topic names between the two boards is what creates the pairing, in the same way that the ESP-NOW exercise paired two boards by swapping which board held which partner's MAC address.</w:t>
+        <w:t>Rather than giving one board a pure publisher role and the other a pure subscriber role, this pairing gives both boards the same capability: each board publishes its own IR sensor reading and subscribes to its partner's IR sensor reading, acting on that reading to control its own motor. This is achieved with two separate topic names — one topic carries messages in each direction. Every board runs the exact same MQTT class and the exact same overall firmware structure; only the two topic names configured in that board's settings file decide which topic it publishes to and which topic it subscribes to. Swapping those two topic names between the two boards is what creates the pairing, in the same way that the ESP-NOW exercise paired two boards by swapping which board held which partner's MAC address.</w:t>
       </w:r>
     </w:p>
     <w:p>
@@ -6773,29 +4311,7 @@
                 <w:sz w:val="19"/>
                 <w:szCs w:val="19"/>
               </w:rPr>
-              <w:t xml:space="preserve">Action Taken </w:t>
-            </w:r>
-            <w:proofErr w:type="gramStart"/>
-            <w:r>
-              <w:rPr>
-                <w:b/>
-                <w:bCs/>
-                <w:color w:val="FFFFFF"/>
-                <w:sz w:val="19"/>
-                <w:szCs w:val="19"/>
-              </w:rPr>
-              <w:t>On</w:t>
-            </w:r>
-            <w:proofErr w:type="gramEnd"/>
-            <w:r>
-              <w:rPr>
-                <w:b/>
-                <w:bCs/>
-                <w:color w:val="FFFFFF"/>
-                <w:sz w:val="19"/>
-                <w:szCs w:val="19"/>
-              </w:rPr>
-              <w:t xml:space="preserve"> Receive</w:t>
+              <w:t xml:space="preserve">Action Taken On Receive</w:t>
             </w:r>
           </w:p>
         </w:tc>
@@ -6849,7 +4365,7 @@
                 <w:sz w:val="19"/>
                 <w:szCs w:val="19"/>
               </w:rPr>
-              <w:t>IR obstacle sensor</w:t>
+              <w:t>IR obstacle sensor + L298N DC motor (identical to Board B)</w:t>
             </w:r>
           </w:p>
         </w:tc>
@@ -6872,7 +4388,7 @@
                 <w:sz w:val="19"/>
                 <w:szCs w:val="19"/>
               </w:rPr>
-              <w:t>Sensor-status topic</w:t>
+              <w:t>Board A IR-status topic</w:t>
             </w:r>
           </w:p>
         </w:tc>
@@ -6895,7 +4411,7 @@
                 <w:sz w:val="19"/>
                 <w:szCs w:val="19"/>
               </w:rPr>
-              <w:t>Motor-status topic</w:t>
+              <w:t>Board B IR-status topic</w:t>
             </w:r>
           </w:p>
         </w:tc>
@@ -6918,7 +4434,7 @@
                 <w:sz w:val="19"/>
                 <w:szCs w:val="19"/>
               </w:rPr>
-              <w:t>Can react to the partner board's reported state</w:t>
+              <w:t>Stops its own motor when Board B's IR sensor reports a detection; drives forward when Board B reports a clear path</w:t>
             </w:r>
           </w:p>
         </w:tc>
@@ -6972,7 +4488,7 @@
                 <w:sz w:val="19"/>
                 <w:szCs w:val="19"/>
               </w:rPr>
-              <w:t>L298N DC motor</w:t>
+              <w:t>IR obstacle sensor + L298N DC motor (identical to Board A)</w:t>
             </w:r>
           </w:p>
         </w:tc>
@@ -6995,7 +4511,7 @@
                 <w:sz w:val="19"/>
                 <w:szCs w:val="19"/>
               </w:rPr>
-              <w:t>Motor-status topic</w:t>
+              <w:t>Board B IR-status topic</w:t>
             </w:r>
           </w:p>
         </w:tc>
@@ -7018,7 +4534,7 @@
                 <w:sz w:val="19"/>
                 <w:szCs w:val="19"/>
               </w:rPr>
-              <w:t>Sensor-status topic</w:t>
+              <w:t>Board A IR-status topic</w:t>
             </w:r>
           </w:p>
         </w:tc>
@@ -7041,7 +4557,7 @@
                 <w:sz w:val="19"/>
                 <w:szCs w:val="19"/>
               </w:rPr>
-              <w:t>Drives the motor forward or stops it based on the sensor state received</w:t>
+              <w:t>Stops its own motor when Board A's IR sensor reports a detection; drives forward when Board A reports a clear path</w:t>
             </w:r>
           </w:p>
         </w:tc>
@@ -7107,21 +4623,7 @@
         <w:rPr>
           <w:color w:val="222222"/>
         </w:rPr>
-        <w:t xml:space="preserve">An L298N class (header + </w:t>
-      </w:r>
-      <w:proofErr w:type="gramStart"/>
-      <w:r>
-        <w:rPr>
-          <w:color w:val="222222"/>
-        </w:rPr>
-        <w:t>implementation) —</w:t>
-      </w:r>
-      <w:proofErr w:type="gramEnd"/>
-      <w:r>
-        <w:rPr>
-          <w:color w:val="222222"/>
-        </w:rPr>
-        <w:t xml:space="preserve"> reused unchanged from Project 3 for motor direction/speed control</w:t>
+        <w:t xml:space="preserve">An L298N class (header + implementation) — reused unchanged from Project 3 for motor direction/speed control</w:t>
       </w:r>
     </w:p>
     <w:p>
@@ -7202,49 +4704,7 @@
         <w:rPr>
           <w:color w:val="222222"/>
         </w:rPr>
-        <w:t xml:space="preserve">Exactly as in Project 3, every credential, pin number, and protocol </w:t>
-      </w:r>
-      <w:proofErr w:type="gramStart"/>
-      <w:r>
-        <w:rPr>
-          <w:color w:val="222222"/>
-        </w:rPr>
-        <w:t>constant</w:t>
-      </w:r>
-      <w:proofErr w:type="gramEnd"/>
-      <w:r>
-        <w:rPr>
-          <w:color w:val="222222"/>
-        </w:rPr>
-        <w:t xml:space="preserve"> lives in a single settings file so nothing is </w:t>
-      </w:r>
-      <w:proofErr w:type="gramStart"/>
-      <w:r>
-        <w:rPr>
-          <w:color w:val="222222"/>
-        </w:rPr>
-        <w:t>hard-coded</w:t>
-      </w:r>
-      <w:proofErr w:type="gramEnd"/>
-      <w:r>
-        <w:rPr>
-          <w:color w:val="222222"/>
-        </w:rPr>
-        <w:t xml:space="preserve"> inside an implementation file. This is what keeps the two boards interchangeable: the class code never changes between the two students' builds, only the settings file does — including which topic name is assigned to "publish" and which is assigned to "subscribe" on that </w:t>
-      </w:r>
-      <w:proofErr w:type="gramStart"/>
-      <w:r>
-        <w:rPr>
-          <w:color w:val="222222"/>
-        </w:rPr>
-        <w:t>particular board</w:t>
-      </w:r>
-      <w:proofErr w:type="gramEnd"/>
-      <w:r>
-        <w:rPr>
-          <w:color w:val="222222"/>
-        </w:rPr>
-        <w:t>.</w:t>
+        <w:t xml:space="preserve">Exactly as in Project 3, every credential, pin number, and protocol constant lives in a single settings file so nothing is hard-coded inside an implementation file. This is what keeps the two boards interchangeable: the class code never changes between the two students' builds, only the settings file does — including which topic name is assigned to "publish" and which is assigned to "subscribe" on that particular board.</w:t>
       </w:r>
     </w:p>
     <w:p>
@@ -7349,9 +4809,24 @@
           <w:sz w:val="22"/>
           <w:szCs w:val="22"/>
         </w:rPr>
-        <w:t xml:space="preserve">3. L298N Motor Driver — Reused </w:t>
-      </w:r>
-      <w:proofErr w:type="gramStart"/>
+        <w:t xml:space="preserve">3. L298N Motor Driver — Reused From Project 3</w:t>
+      </w:r>
+    </w:p>
+    <w:p>
+      <w:pPr>
+        <w:spacing w:after="140" w:line="276" w:lineRule="auto"/>
+      </w:pPr>
+      <w:r>
+        <w:rPr>
+          <w:color w:val="222222"/>
+        </w:rPr>
+        <w:t xml:space="preserve">No changes were required to the motor driver class itself. It still exposes the same begin, forward, reverse, stop, and brake behavior; only the trigger for calling these actions changed — from an ESP-NOW receive event to an MQTT receive event.</w:t>
+      </w:r>
+    </w:p>
+    <w:p>
+      <w:pPr>
+        <w:spacing w:before="200" w:after="100"/>
+      </w:pPr>
       <w:r>
         <w:rPr>
           <w:b/>
@@ -7360,18 +4835,7 @@
           <w:sz w:val="22"/>
           <w:szCs w:val="22"/>
         </w:rPr>
-        <w:t>From</w:t>
-      </w:r>
-      <w:proofErr w:type="gramEnd"/>
-      <w:r>
-        <w:rPr>
-          <w:b/>
-          <w:bCs/>
-          <w:color w:val="1F3B57"/>
-          <w:sz w:val="22"/>
-          <w:szCs w:val="22"/>
-        </w:rPr>
-        <w:t xml:space="preserve"> Project 3</w:t>
+        <w:t>4. Main Application Logic</w:t>
       </w:r>
     </w:p>
     <w:p>
@@ -7382,47 +4846,7 @@
         <w:rPr>
           <w:color w:val="222222"/>
         </w:rPr>
-        <w:t xml:space="preserve">No changes were required to the motor </w:t>
-      </w:r>
-      <w:proofErr w:type="gramStart"/>
-      <w:r>
-        <w:rPr>
-          <w:color w:val="222222"/>
-        </w:rPr>
-        <w:t>driver</w:t>
-      </w:r>
-      <w:proofErr w:type="gramEnd"/>
-      <w:r>
-        <w:rPr>
-          <w:color w:val="222222"/>
-        </w:rPr>
-        <w:t xml:space="preserve"> class itself. It still exposes the same begin, forward, reverse, stop, and brake behavior; only the trigger for calling these actions changed — from an ESP-NOW receive event to an MQTT receive event.</w:t>
-      </w:r>
-    </w:p>
-    <w:p>
-      <w:pPr>
-        <w:spacing w:before="200" w:after="100"/>
-      </w:pPr>
-      <w:r>
-        <w:rPr>
-          <w:b/>
-          <w:bCs/>
-          <w:color w:val="1F3B57"/>
-          <w:sz w:val="22"/>
-          <w:szCs w:val="22"/>
-        </w:rPr>
-        <w:t>4. Main Application Logic</w:t>
-      </w:r>
-    </w:p>
-    <w:p>
-      <w:pPr>
-        <w:spacing w:after="140" w:line="276" w:lineRule="auto"/>
-      </w:pPr>
-      <w:r>
-        <w:rPr>
-          <w:color w:val="222222"/>
-        </w:rPr>
-        <w:t>Each board's main file stays intentionally thin: setup brings up the pins and the MQTT connection and registers the message handler; the main loop keeps the MQTT connection alive and runs the safety watchdog. On the motor board, all decision-making about motor state lives in exactly one place — the incoming-message handler — rather than being spread across the rest of the program.</w:t>
+        <w:t>Each board's main file stays intentionally thin: setup brings up the pins and the MQTT connection and registers the message handler; the main loop keeps the MQTT connection alive and runs the safety watchdog. On each board, all decision-making about its own motor state lives in exactly one place — the incoming-message handler — rather than being spread across the rest of the program.</w:t>
       </w:r>
     </w:p>
     <w:p>
@@ -7550,35 +4974,7 @@
           <w:color w:val="222222"/>
         </w:rPr>
         <w:lastRenderedPageBreak/>
-        <w:t xml:space="preserve">Because both boards now subscribe to a topic </w:t>
-      </w:r>
-      <w:proofErr w:type="gramStart"/>
-      <w:r>
-        <w:rPr>
-          <w:color w:val="222222"/>
-        </w:rPr>
-        <w:t>and also</w:t>
-      </w:r>
-      <w:proofErr w:type="gramEnd"/>
-      <w:r>
-        <w:rPr>
-          <w:color w:val="222222"/>
-        </w:rPr>
-        <w:t xml:space="preserve"> publish on a different topic, the incoming-message handler checks which topic a given message </w:t>
-      </w:r>
-      <w:proofErr w:type="gramStart"/>
-      <w:r>
-        <w:rPr>
-          <w:color w:val="222222"/>
-        </w:rPr>
-        <w:t>actually arrived</w:t>
-      </w:r>
-      <w:proofErr w:type="gramEnd"/>
-      <w:r>
-        <w:rPr>
-          <w:color w:val="222222"/>
-        </w:rPr>
-        <w:t xml:space="preserve"> on before acting on it. This guard exists so that a board only reacts to messages meant for it — the one topic it is genuinely subscribed to — and ignores anything else, which becomes especially important once more than one topic, or more than one pair of boards, share the same broker.</w:t>
+        <w:t xml:space="preserve">Because both boards now subscribe to a topic and also publish on a different topic, the incoming-message handler checks which topic a given message actually arrived on before acting on it. This guard exists so that a board only reacts to messages meant for it — the one topic it is genuinely subscribed to — and ignores anything else, which becomes especially important once more than one topic, or more than one pair of boards, share the same broker.</w:t>
       </w:r>
     </w:p>
     <w:p>
@@ -7607,7 +5003,7 @@
         <w:rPr>
           <w:color w:val="222222"/>
         </w:rPr>
-        <w:t>The motor board keeps track of the last time it received a valid update from its partner. On every pass through the main loop, if too much time has passed since the last update — a short, fixed timeout — the motor is force-stopped and the stop indicator is lit, regardless of whatever the last received command happened to be.</w:t>
+        <w:t>Each board keeps track of the last time it received a valid update from its partner. On every pass through the main loop, if too much time has passed since the last update — a short, fixed timeout — that board's own motor is force-stopped and its stop indicator is lit, regardless of whatever the last received command happened to be.</w:t>
       </w:r>
     </w:p>
     <w:tbl>
@@ -7668,7 +5064,7 @@
                 <w:sz w:val="20"/>
                 <w:szCs w:val="20"/>
               </w:rPr>
-              <w:t>This protects the motor if the partner board loses Wi-Fi, the broker connection drops, or the partner board crashes: the motor board does not simply keep repeating the last known command forever. This is the same defensive pattern used for the E-Stop and overcurrent safety rule in Project 3, adapted to a networked link where silence itself now counts as a fault condition.</w:t>
+              <w:t>This protects each board's motor if the partner board loses Wi-Fi, the broker connection drops, or the partner board crashes: neither board simply keeps repeating the last known command forever. This is the same defensive pattern used for the E-Stop and overcurrent safety rule in Project 3, adapted to a networked link where silence itself now counts as a fault condition.</w:t>
             </w:r>
           </w:p>
         </w:tc>
@@ -7705,7 +5101,7 @@
         <w:rPr>
           <w:color w:val="222222"/>
         </w:rPr>
-        <w:t>A received value indicating an object was detected turns the running indicator on, turns the stop indicator off, and drives the motor forward at full speed.</w:t>
+        <w:t>A received value indicating the partner board's IR sensor detected an object turns the stop indicator on, turns the running indicator off, and stops the local motor.</w:t>
       </w:r>
     </w:p>
     <w:p>
@@ -7721,7 +5117,7 @@
         <w:rPr>
           <w:color w:val="222222"/>
         </w:rPr>
-        <w:t>A received value indicating the path is clear turns the running indicator off, turns the stop indicator on, and stops the motor.</w:t>
+        <w:t>A received value indicating the partner board's path is clear turns the running indicator on, turns the stop indicator off, and drives the local motor forward at full speed.</w:t>
       </w:r>
     </w:p>
     <w:p>
@@ -7754,51 +5150,7 @@
           <w:sz w:val="25"/>
           <w:szCs w:val="25"/>
         </w:rPr>
-        <w:t xml:space="preserve">5.5 Clean-Code / </w:t>
-      </w:r>
-      <w:proofErr w:type="spellStart"/>
-      <w:r>
-        <w:rPr>
-          <w:b/>
-          <w:bCs/>
-          <w:color w:val="2E7D8C"/>
-          <w:sz w:val="25"/>
-          <w:szCs w:val="25"/>
-        </w:rPr>
-        <w:t>PlatformIO</w:t>
-      </w:r>
-      <w:proofErr w:type="spellEnd"/>
-      <w:r>
-        <w:rPr>
-          <w:b/>
-          <w:bCs/>
-          <w:color w:val="2E7D8C"/>
-          <w:sz w:val="25"/>
-          <w:szCs w:val="25"/>
-        </w:rPr>
-        <w:t xml:space="preserve"> Notes Carried Forward </w:t>
-      </w:r>
-      <w:proofErr w:type="gramStart"/>
-      <w:r>
-        <w:rPr>
-          <w:b/>
-          <w:bCs/>
-          <w:color w:val="2E7D8C"/>
-          <w:sz w:val="25"/>
-          <w:szCs w:val="25"/>
-        </w:rPr>
-        <w:t>From</w:t>
-      </w:r>
-      <w:proofErr w:type="gramEnd"/>
-      <w:r>
-        <w:rPr>
-          <w:b/>
-          <w:bCs/>
-          <w:color w:val="2E7D8C"/>
-          <w:sz w:val="25"/>
-          <w:szCs w:val="25"/>
-        </w:rPr>
-        <w:t xml:space="preserve"> Project 3</w:t>
+        <w:t xml:space="preserve">5.5 Clean-Code / PlatformIO Notes Carried Forward From Project 3</w:t>
       </w:r>
       <w:bookmarkEnd w:id="20"/>
     </w:p>
@@ -7895,21 +5247,7 @@
         <w:rPr>
           <w:color w:val="222222"/>
         </w:rPr>
-        <w:t xml:space="preserve">The complete message path for one detection cycle, now </w:t>
-      </w:r>
-      <w:proofErr w:type="gramStart"/>
-      <w:r>
-        <w:rPr>
-          <w:color w:val="222222"/>
-        </w:rPr>
-        <w:t>using</w:t>
-      </w:r>
-      <w:proofErr w:type="gramEnd"/>
-      <w:r>
-        <w:rPr>
-          <w:color w:val="222222"/>
-        </w:rPr>
-        <w:t xml:space="preserve"> two topics so the exchange is symmetric in both directions:</w:t>
+        <w:t xml:space="preserve">The complete message path for one detection cycle, now using two topics so the exchange is symmetric in both directions:</w:t>
       </w:r>
     </w:p>
     <w:p>
@@ -7941,7 +5279,7 @@
         <w:rPr>
           <w:color w:val="222222"/>
         </w:rPr>
-        <w:t>2. Board A publishes that state, as a simple value, to the sensor-status topic on the shared public broker.</w:t>
+        <w:t>2. Board A publishes that state, as a simple value, to the Board A IR-status topic on the shared public broker.</w:t>
       </w:r>
     </w:p>
     <w:p>
@@ -7957,21 +5295,7 @@
         <w:rPr>
           <w:color w:val="222222"/>
         </w:rPr>
-        <w:t xml:space="preserve">3. The broker receives the </w:t>
-      </w:r>
-      <w:proofErr w:type="gramStart"/>
-      <w:r>
-        <w:rPr>
-          <w:color w:val="222222"/>
-        </w:rPr>
-        <w:t>publish</w:t>
-      </w:r>
-      <w:proofErr w:type="gramEnd"/>
-      <w:r>
-        <w:rPr>
-          <w:color w:val="222222"/>
-        </w:rPr>
-        <w:t xml:space="preserve"> and checks its subscription table for that exact topic.</w:t>
+        <w:t xml:space="preserve">3. The broker receives the publish and checks its subscription table for that exact topic.</w:t>
       </w:r>
     </w:p>
     <w:p>
@@ -7987,7 +5311,7 @@
         <w:rPr>
           <w:color w:val="222222"/>
         </w:rPr>
-        <w:t>4. The broker forwards the message to every client subscribed to the sensor-status topic — in this pairing, Board B.</w:t>
+        <w:t>4. The broker forwards the message to every client subscribed to the Board A IR-status topic — in this pairing, Board B.</w:t>
       </w:r>
     </w:p>
     <w:p>
@@ -8004,7 +5328,7 @@
           <w:color w:val="222222"/>
         </w:rPr>
         <w:lastRenderedPageBreak/>
-        <w:t>5. Board B's message handler checks that the message truly arrived on the topic it is subscribed to, updates its last-received timestamp, and sets the motor state and LEDs accordingly.</w:t>
+        <w:t>5. Board B's message handler checks that the message truly arrived on the topic it is subscribed to, updates its last-received timestamp, and sets its own motor state and LEDs accordingly — stopping its motor if Board A reports a detection, or driving it forward if Board A reports a clear path.</w:t>
       </w:r>
     </w:p>
     <w:p>
@@ -8020,21 +5344,7 @@
         <w:rPr>
           <w:color w:val="222222"/>
         </w:rPr>
-        <w:t xml:space="preserve">6. Board B could, symmetrically, publish its own state on the motor-status topic, which Board A is subscribed to and can react to in </w:t>
-      </w:r>
-      <w:proofErr w:type="gramStart"/>
-      <w:r>
-        <w:rPr>
-          <w:color w:val="222222"/>
-        </w:rPr>
-        <w:t>exactly the same</w:t>
-      </w:r>
-      <w:proofErr w:type="gramEnd"/>
-      <w:r>
-        <w:rPr>
-          <w:color w:val="222222"/>
-        </w:rPr>
-        <w:t xml:space="preserve"> way — the same mechanism works in either direction.</w:t>
+        <w:t xml:space="preserve">6. Board B symmetrically publishes its own IR sensor reading on the Board B IR-status topic, which Board A is subscribed to; Board A reacts the same way, stopping or running its own motor based on Board B's reading — the same mechanism works in either direction.</w:t>
       </w:r>
     </w:p>
     <w:p>
@@ -8228,7 +5538,7 @@
                 <w:sz w:val="19"/>
                 <w:szCs w:val="19"/>
               </w:rPr>
-              <w:t>Sensor-status topic</w:t>
+              <w:t>Board A IR-status topic</w:t>
             </w:r>
           </w:p>
         </w:tc>
@@ -8251,7 +5561,7 @@
                 <w:sz w:val="19"/>
                 <w:szCs w:val="19"/>
               </w:rPr>
-              <w:t>Board A (IR sensor)</w:t>
+              <w:t>Board A (IR sensor + motor)</w:t>
             </w:r>
           </w:p>
         </w:tc>
@@ -8274,7 +5584,7 @@
                 <w:sz w:val="19"/>
                 <w:szCs w:val="19"/>
               </w:rPr>
-              <w:t>Board B (motor)</w:t>
+              <w:t>Board B (IR sensor + motor)</w:t>
             </w:r>
           </w:p>
         </w:tc>
@@ -8297,7 +5607,7 @@
                 <w:sz w:val="19"/>
                 <w:szCs w:val="19"/>
               </w:rPr>
-              <w:t>Reports detected / clear so the motor board can react</w:t>
+              <w:t>Reports Board A's detected/clear reading so Board B can stop or run its own motor accordingly</w:t>
             </w:r>
           </w:p>
         </w:tc>
@@ -8328,7 +5638,7 @@
                 <w:sz w:val="19"/>
                 <w:szCs w:val="19"/>
               </w:rPr>
-              <w:t>Motor-status topic</w:t>
+              <w:t>Board B IR-status topic</w:t>
             </w:r>
           </w:p>
         </w:tc>
@@ -8351,7 +5661,7 @@
                 <w:sz w:val="19"/>
                 <w:szCs w:val="19"/>
               </w:rPr>
-              <w:t>Board B (motor)</w:t>
+              <w:t>Board B (IR sensor + motor)</w:t>
             </w:r>
           </w:p>
         </w:tc>
@@ -8374,7 +5684,7 @@
                 <w:sz w:val="19"/>
                 <w:szCs w:val="19"/>
               </w:rPr>
-              <w:t>Board A (IR sensor)</w:t>
+              <w:t>Board A (IR sensor + motor)</w:t>
             </w:r>
           </w:p>
         </w:tc>
@@ -8397,7 +5707,7 @@
                 <w:sz w:val="19"/>
                 <w:szCs w:val="19"/>
               </w:rPr>
-              <w:t>Reports the motor's current state back to the sensor board</w:t>
+              <w:t>Reports Board B's detected/clear reading so Board A can stop or run its own motor accordingly</w:t>
             </w:r>
           </w:p>
         </w:tc>
@@ -8420,17 +5730,7 @@
           <w:sz w:val="30"/>
           <w:szCs w:val="30"/>
         </w:rPr>
-        <w:t>7</w:t>
-      </w:r>
-      <w:r>
-        <w:rPr>
-          <w:b/>
-          <w:bCs/>
-          <w:color w:val="1F3B57"/>
-          <w:sz w:val="30"/>
-          <w:szCs w:val="30"/>
-        </w:rPr>
-        <w:t>. References</w:t>
+        <w:t>7. References</w:t>
       </w:r>
       <w:bookmarkEnd w:id="22"/>
     </w:p>
@@ -8465,19 +5765,11 @@
         <w:spacing w:after="90"/>
       </w:pPr>
       <w:hyperlink r:id="rId9" w:history="1">
-        <w:proofErr w:type="spellStart"/>
         <w:r>
           <w:rPr>
             <w:rStyle w:val="Hyperlink"/>
           </w:rPr>
-          <w:t>GeeksforGeeks</w:t>
-        </w:r>
-        <w:proofErr w:type="spellEnd"/>
-        <w:r>
-          <w:rPr>
-            <w:rStyle w:val="Hyperlink"/>
-          </w:rPr>
-          <w:t xml:space="preserve"> — Introduction of Message Queue Telemetry Transport Protocol (MQTT)</w:t>
+          <w:t xml:space="preserve">GeeksforGeeks — Introduction of Message Queue Telemetry Transport Protocol (MQTT)</w:t>
         </w:r>
       </w:hyperlink>
     </w:p>

</xml_diff>